<commit_message>
docs(features): the regenerated .docx
Regenerated from the UNCHANGED committed .html (git reports the .html clean), so
the content is equivalent -- Word COM output is not byte-deterministic, and the
same source produces a different file each conversion. Verified before
committing by unzipping word/document.xml and probing for Appendix A, A.4, A.5,
the version and the rule total; all present.

Committed rather than restored: this repo forbids `git checkout -- <path>`, and
the file is a build artifact of a source that is already in.

Co-Authored-By: Claude Opus 5 (1M context) <noreply@anthropic.com>
</commit_message>
<xml_diff>
--- a/docs/drag-lint-features-2026-09-16.docx
+++ b/docs/drag-lint-features-2026-09-16.docx
@@ -96,8 +96,9 @@
           <w:szCs w:val="22"/>
           <w:lang w:val="en"/>
         </w:rPr>
-        <w:t xml:space="preserve"> drag-lint is an AST-exact symbol index, linter and refactoring engine for Delphi / Object Pascal. It parses your code with tree-sitter into a SQLite index, then answers questions about it -- symbols, callers, types, </w:t>
-      </w:r>
+        <w:t xml:space="preserve"> </w:t>
+      </w:r>
+      <w:proofErr w:type="gramStart"/>
       <w:r>
         <w:rPr>
           <w:rFonts w:ascii="Calibri" w:hAnsi="Calibri" w:cs="Calibri"/>
@@ -106,7 +107,18 @@
           <w:szCs w:val="22"/>
           <w:lang w:val="en"/>
         </w:rPr>
-        <w:t>dependencies, documentation -- without a compiler and without the IDE having the project open. The Component Converter is a rules-driven system built on that index for migrating legacy VCL components to modern replacements.</w:t>
+        <w:t>drag</w:t>
+      </w:r>
+      <w:proofErr w:type="gramEnd"/>
+      <w:r>
+        <w:rPr>
+          <w:rFonts w:ascii="Calibri" w:hAnsi="Calibri" w:cs="Calibri"/>
+          <w:color w:val="1A1A1A"/>
+          <w:sz w:val="22"/>
+          <w:szCs w:val="22"/>
+          <w:lang w:val="en"/>
+        </w:rPr>
+        <w:t>-lint is an AST-exact symbol index, linter and refactoring engine for Delphi / Object Pascal. It parses your code with tree-sitter into a SQLite index, then answers questions about it -- symbols, callers, types, dependencies, documentation -- without a compiler and without the IDE having the project open. The Component Converter is a rules-driven system built on that index for migrating legacy VCL components to modern replacements.</w:t>
       </w:r>
     </w:p>
     <w:p>
@@ -164,7 +176,29 @@
           <w:szCs w:val="22"/>
           <w:lang w:val="en"/>
         </w:rPr>
-        <w:t xml:space="preserve"> via tree-sitter grammars for Pascal and DFM -- no regex, no string-literal or comment noise.</w:t>
+        <w:t xml:space="preserve"> via tree-sitter </w:t>
+      </w:r>
+      <w:proofErr w:type="gramStart"/>
+      <w:r>
+        <w:rPr>
+          <w:rFonts w:ascii="Calibri" w:eastAsia="Times New Roman" w:hAnsi="Calibri" w:cs="Calibri"/>
+          <w:color w:val="1A1A1A"/>
+          <w:sz w:val="22"/>
+          <w:szCs w:val="22"/>
+          <w:lang w:val="en"/>
+        </w:rPr>
+        <w:t>grammars</w:t>
+      </w:r>
+      <w:proofErr w:type="gramEnd"/>
+      <w:r>
+        <w:rPr>
+          <w:rFonts w:ascii="Calibri" w:eastAsia="Times New Roman" w:hAnsi="Calibri" w:cs="Calibri"/>
+          <w:color w:val="1A1A1A"/>
+          <w:sz w:val="22"/>
+          <w:szCs w:val="22"/>
+          <w:lang w:val="en"/>
+        </w:rPr>
+        <w:t xml:space="preserve"> for Pascal and DFM -- no regex, no string-literal or comment noise.</w:t>
       </w:r>
     </w:p>
     <w:p>
@@ -260,7 +294,18 @@
           <w:szCs w:val="22"/>
           <w:lang w:val="en"/>
         </w:rPr>
-        <w:t xml:space="preserve"> -- a project index contains exactly what the compiler sees: project members, transitively used project-local units, each unit's sibling </w:t>
+        <w:t xml:space="preserve"> -- a project index contains exactly what the compiler sees: project members, transitively used project-local units, each unit's </w:t>
+      </w:r>
+      <w:proofErr w:type="gramStart"/>
+      <w:r>
+        <w:rPr>
+          <w:rFonts w:ascii="Calibri" w:eastAsia="Times New Roman" w:hAnsi="Calibri" w:cs="Calibri"/>
+          <w:color w:val="1A1A1A"/>
+          <w:sz w:val="22"/>
+          <w:szCs w:val="22"/>
+          <w:lang w:val="en"/>
+        </w:rPr>
+        <w:t xml:space="preserve">sibling </w:t>
       </w:r>
       <w:r>
         <w:rPr>
@@ -268,8 +313,19 @@
           <w:color w:val="1A1A1A"/>
           <w:lang w:val="en"/>
         </w:rPr>
-        <w:t>.dfm</w:t>
-      </w:r>
+        <w:t>.</w:t>
+      </w:r>
+      <w:proofErr w:type="spellStart"/>
+      <w:r>
+        <w:rPr>
+          <w:rStyle w:val="HTMLCode"/>
+          <w:color w:val="1A1A1A"/>
+          <w:lang w:val="en"/>
+        </w:rPr>
+        <w:t>dfm</w:t>
+      </w:r>
+      <w:proofErr w:type="spellEnd"/>
+      <w:proofErr w:type="gramEnd"/>
       <w:r>
         <w:rPr>
           <w:rFonts w:ascii="Calibri" w:eastAsia="Times New Roman" w:hAnsi="Calibri" w:cs="Calibri"/>
@@ -296,7 +352,29 @@
           <w:szCs w:val="22"/>
           <w:lang w:val="en"/>
         </w:rPr>
-        <w:t xml:space="preserve"> includes. Loose unreferenced files stay out.</w:t>
+        <w:t xml:space="preserve"> includes. </w:t>
+      </w:r>
+      <w:proofErr w:type="gramStart"/>
+      <w:r>
+        <w:rPr>
+          <w:rFonts w:ascii="Calibri" w:eastAsia="Times New Roman" w:hAnsi="Calibri" w:cs="Calibri"/>
+          <w:color w:val="1A1A1A"/>
+          <w:sz w:val="22"/>
+          <w:szCs w:val="22"/>
+          <w:lang w:val="en"/>
+        </w:rPr>
+        <w:t>Loose</w:t>
+      </w:r>
+      <w:proofErr w:type="gramEnd"/>
+      <w:r>
+        <w:rPr>
+          <w:rFonts w:ascii="Calibri" w:eastAsia="Times New Roman" w:hAnsi="Calibri" w:cs="Calibri"/>
+          <w:color w:val="1A1A1A"/>
+          <w:sz w:val="22"/>
+          <w:szCs w:val="22"/>
+          <w:lang w:val="en"/>
+        </w:rPr>
+        <w:t xml:space="preserve"> unreferenced files stay out.</w:t>
       </w:r>
     </w:p>
     <w:p>
@@ -569,17 +647,80 @@
           <w:szCs w:val="22"/>
           <w:lang w:val="en"/>
         </w:rPr>
+        <w:t xml:space="preserve"> -- add a project to the </w:t>
+      </w:r>
+      <w:proofErr w:type="gramStart"/>
+      <w:r>
+        <w:rPr>
+          <w:rFonts w:ascii="Calibri" w:eastAsia="Times New Roman" w:hAnsi="Calibri" w:cs="Calibri"/>
+          <w:color w:val="1A1A1A"/>
+          <w:sz w:val="22"/>
+          <w:szCs w:val="22"/>
+          <w:lang w:val="en"/>
+        </w:rPr>
+        <w:t>manifest, and</w:t>
+      </w:r>
+      <w:proofErr w:type="gramEnd"/>
+      <w:r>
+        <w:rPr>
+          <w:rFonts w:ascii="Calibri" w:eastAsia="Times New Roman" w:hAnsi="Calibri" w:cs="Calibri"/>
+          <w:color w:val="1A1A1A"/>
+          <w:sz w:val="22"/>
+          <w:szCs w:val="22"/>
+          <w:lang w:val="en"/>
+        </w:rPr>
+        <w:t xml:space="preserve"> sync </w:t>
+      </w:r>
+      <w:proofErr w:type="gramStart"/>
+      <w:r>
+        <w:rPr>
+          <w:rFonts w:ascii="Calibri" w:eastAsia="Times New Roman" w:hAnsi="Calibri" w:cs="Calibri"/>
+          <w:color w:val="1A1A1A"/>
+          <w:sz w:val="22"/>
+          <w:szCs w:val="22"/>
+          <w:lang w:val="en"/>
+        </w:rPr>
+        <w:t xml:space="preserve">its </w:t>
+      </w:r>
+      <w:r>
+        <w:rPr>
+          <w:rStyle w:val="HTMLCode"/>
+          <w:color w:val="1A1A1A"/>
+          <w:lang w:val="en"/>
+        </w:rPr>
+        <w:t>.</w:t>
+      </w:r>
+      <w:proofErr w:type="spellStart"/>
+      <w:r>
+        <w:rPr>
+          <w:rStyle w:val="HTMLCode"/>
+          <w:color w:val="1A1A1A"/>
+          <w:lang w:val="en"/>
+        </w:rPr>
+        <w:t>dproj</w:t>
+      </w:r>
+      <w:proofErr w:type="spellEnd"/>
+      <w:proofErr w:type="gramEnd"/>
+      <w:r>
+        <w:rPr>
+          <w:rFonts w:ascii="Calibri" w:eastAsia="Times New Roman" w:hAnsi="Calibri" w:cs="Calibri"/>
+          <w:color w:val="1A1A1A"/>
+          <w:sz w:val="22"/>
+          <w:szCs w:val="22"/>
+          <w:lang w:val="en"/>
+        </w:rPr>
         <w:t xml:space="preserve"> </w:t>
       </w:r>
-      <w:r>
-        <w:rPr>
-          <w:rFonts w:ascii="Calibri" w:eastAsia="Times New Roman" w:hAnsi="Calibri" w:cs="Calibri"/>
-          <w:color w:val="1A1A1A"/>
-          <w:sz w:val="22"/>
-          <w:szCs w:val="22"/>
-          <w:lang w:val="en"/>
-        </w:rPr>
-        <w:t xml:space="preserve">-- add a project to the manifest, and sync its </w:t>
+      <w:proofErr w:type="gramStart"/>
+      <w:r>
+        <w:rPr>
+          <w:rFonts w:ascii="Calibri" w:eastAsia="Times New Roman" w:hAnsi="Calibri" w:cs="Calibri"/>
+          <w:color w:val="1A1A1A"/>
+          <w:sz w:val="22"/>
+          <w:szCs w:val="22"/>
+          <w:lang w:val="en"/>
+        </w:rPr>
+        <w:t xml:space="preserve">/ </w:t>
       </w:r>
       <w:r>
         <w:rPr>
@@ -587,35 +728,50 @@
           <w:color w:val="1A1A1A"/>
           <w:lang w:val="en"/>
         </w:rPr>
-        <w:t>.dproj</w:t>
-      </w:r>
-      <w:r>
-        <w:rPr>
-          <w:rFonts w:ascii="Calibri" w:eastAsia="Times New Roman" w:hAnsi="Calibri" w:cs="Calibri"/>
-          <w:color w:val="1A1A1A"/>
-          <w:sz w:val="22"/>
-          <w:szCs w:val="22"/>
-          <w:lang w:val="en"/>
-        </w:rPr>
-        <w:t xml:space="preserve"> / </w:t>
-      </w:r>
+        <w:t>.</w:t>
+      </w:r>
+      <w:proofErr w:type="spellStart"/>
       <w:r>
         <w:rPr>
           <w:rStyle w:val="HTMLCode"/>
           <w:color w:val="1A1A1A"/>
           <w:lang w:val="en"/>
         </w:rPr>
-        <w:t>.dpr</w:t>
-      </w:r>
-      <w:r>
-        <w:rPr>
-          <w:rFonts w:ascii="Calibri" w:eastAsia="Times New Roman" w:hAnsi="Calibri" w:cs="Calibri"/>
-          <w:color w:val="1A1A1A"/>
-          <w:sz w:val="22"/>
-          <w:szCs w:val="22"/>
-          <w:lang w:val="en"/>
-        </w:rPr>
-        <w:t xml:space="preserve"> member list against the units it actually uses.</w:t>
+        <w:t>dpr</w:t>
+      </w:r>
+      <w:proofErr w:type="spellEnd"/>
+      <w:proofErr w:type="gramEnd"/>
+      <w:r>
+        <w:rPr>
+          <w:rFonts w:ascii="Calibri" w:eastAsia="Times New Roman" w:hAnsi="Calibri" w:cs="Calibri"/>
+          <w:color w:val="1A1A1A"/>
+          <w:sz w:val="22"/>
+          <w:szCs w:val="22"/>
+          <w:lang w:val="en"/>
+        </w:rPr>
+        <w:t xml:space="preserve"> member list against the units it </w:t>
+      </w:r>
+      <w:proofErr w:type="gramStart"/>
+      <w:r>
+        <w:rPr>
+          <w:rFonts w:ascii="Calibri" w:eastAsia="Times New Roman" w:hAnsi="Calibri" w:cs="Calibri"/>
+          <w:color w:val="1A1A1A"/>
+          <w:sz w:val="22"/>
+          <w:szCs w:val="22"/>
+          <w:lang w:val="en"/>
+        </w:rPr>
+        <w:t>actually uses</w:t>
+      </w:r>
+      <w:proofErr w:type="gramEnd"/>
+      <w:r>
+        <w:rPr>
+          <w:rFonts w:ascii="Calibri" w:eastAsia="Times New Roman" w:hAnsi="Calibri" w:cs="Calibri"/>
+          <w:color w:val="1A1A1A"/>
+          <w:sz w:val="22"/>
+          <w:szCs w:val="22"/>
+          <w:lang w:val="en"/>
+        </w:rPr>
+        <w:t>.</w:t>
       </w:r>
     </w:p>
     <w:p>
@@ -654,7 +810,29 @@
           <w:szCs w:val="22"/>
           <w:lang w:val="en"/>
         </w:rPr>
-        <w:t xml:space="preserve"> (FTS5, unicode + trigram) over source text, comments, DFM content and SQL.</w:t>
+        <w:t xml:space="preserve"> (FTS5, </w:t>
+      </w:r>
+      <w:proofErr w:type="spellStart"/>
+      <w:r>
+        <w:rPr>
+          <w:rFonts w:ascii="Calibri" w:eastAsia="Times New Roman" w:hAnsi="Calibri" w:cs="Calibri"/>
+          <w:color w:val="1A1A1A"/>
+          <w:sz w:val="22"/>
+          <w:szCs w:val="22"/>
+          <w:lang w:val="en"/>
+        </w:rPr>
+        <w:t>unicode</w:t>
+      </w:r>
+      <w:proofErr w:type="spellEnd"/>
+      <w:r>
+        <w:rPr>
+          <w:rFonts w:ascii="Calibri" w:eastAsia="Times New Roman" w:hAnsi="Calibri" w:cs="Calibri"/>
+          <w:color w:val="1A1A1A"/>
+          <w:sz w:val="22"/>
+          <w:szCs w:val="22"/>
+          <w:lang w:val="en"/>
+        </w:rPr>
+        <w:t xml:space="preserve"> + trigram) over source text, comments, DFM content and SQL.</w:t>
       </w:r>
     </w:p>
     <w:p>
@@ -790,17 +968,7 @@
           <w:szCs w:val="22"/>
           <w:lang w:val="en"/>
         </w:rPr>
-        <w:t xml:space="preserve"> </w:t>
-      </w:r>
-      <w:r>
-        <w:rPr>
-          <w:rFonts w:ascii="Calibri" w:eastAsia="Times New Roman" w:hAnsi="Calibri" w:cs="Calibri"/>
-          <w:color w:val="1A1A1A"/>
-          <w:sz w:val="22"/>
-          <w:szCs w:val="22"/>
-          <w:lang w:val="en"/>
-        </w:rPr>
-        <w:t xml:space="preserve">-- resolves a symbol to the unit you need to add to a </w:t>
+        <w:t xml:space="preserve"> -- resolves a symbol to the unit you need to add to a </w:t>
       </w:r>
       <w:r>
         <w:rPr>
@@ -847,7 +1015,6 @@
           <w:szCs w:val="22"/>
           <w:lang w:val="en"/>
         </w:rPr>
-        <w:lastRenderedPageBreak/>
         <w:t>What implements this interface?</w:t>
       </w:r>
       <w:r>
@@ -880,7 +1047,29 @@
           <w:szCs w:val="22"/>
           <w:lang w:val="en"/>
         </w:rPr>
-        <w:t xml:space="preserve"> -- hovering an interface lists the classes that implement it and, separately, the interfaces that extend it. The same fact is written into the generated documentation.</w:t>
+        <w:t xml:space="preserve"> -- hovering an interface lists the classes that </w:t>
+      </w:r>
+      <w:proofErr w:type="gramStart"/>
+      <w:r>
+        <w:rPr>
+          <w:rFonts w:ascii="Calibri" w:eastAsia="Times New Roman" w:hAnsi="Calibri" w:cs="Calibri"/>
+          <w:color w:val="1A1A1A"/>
+          <w:sz w:val="22"/>
+          <w:szCs w:val="22"/>
+          <w:lang w:val="en"/>
+        </w:rPr>
+        <w:t>implement it</w:t>
+      </w:r>
+      <w:proofErr w:type="gramEnd"/>
+      <w:r>
+        <w:rPr>
+          <w:rFonts w:ascii="Calibri" w:eastAsia="Times New Roman" w:hAnsi="Calibri" w:cs="Calibri"/>
+          <w:color w:val="1A1A1A"/>
+          <w:sz w:val="22"/>
+          <w:szCs w:val="22"/>
+          <w:lang w:val="en"/>
+        </w:rPr>
+        <w:t xml:space="preserve"> and, separately, the interfaces that extend it. The same fact is written into the generated documentation.</w:t>
       </w:r>
     </w:p>
     <w:p>
@@ -958,7 +1147,18 @@
           <w:szCs w:val="22"/>
           <w:lang w:val="en"/>
         </w:rPr>
-        <w:t xml:space="preserve"> across </w:t>
+        <w:t xml:space="preserve"> </w:t>
+      </w:r>
+      <w:proofErr w:type="gramStart"/>
+      <w:r>
+        <w:rPr>
+          <w:rFonts w:ascii="Calibri" w:eastAsia="Times New Roman" w:hAnsi="Calibri" w:cs="Calibri"/>
+          <w:color w:val="1A1A1A"/>
+          <w:sz w:val="22"/>
+          <w:szCs w:val="22"/>
+          <w:lang w:val="en"/>
+        </w:rPr>
+        <w:t xml:space="preserve">across </w:t>
       </w:r>
       <w:r>
         <w:rPr>
@@ -984,8 +1184,19 @@
           <w:color w:val="1A1A1A"/>
           <w:lang w:val="en"/>
         </w:rPr>
-        <w:t>.dfm</w:t>
-      </w:r>
+        <w:t>.</w:t>
+      </w:r>
+      <w:proofErr w:type="spellStart"/>
+      <w:r>
+        <w:rPr>
+          <w:rStyle w:val="HTMLCode"/>
+          <w:color w:val="1A1A1A"/>
+          <w:lang w:val="en"/>
+        </w:rPr>
+        <w:t>dfm</w:t>
+      </w:r>
+      <w:proofErr w:type="spellEnd"/>
+      <w:proofErr w:type="gramEnd"/>
       <w:r>
         <w:rPr>
           <w:rFonts w:ascii="Calibri" w:eastAsia="Times New Roman" w:hAnsi="Calibri" w:cs="Calibri"/>
@@ -1002,27 +1213,27 @@
           <w:color w:val="1A1A1A"/>
           <w:lang w:val="en"/>
         </w:rPr>
-        <w:t>.sql</w:t>
-      </w:r>
-      <w:r>
-        <w:rPr>
-          <w:rFonts w:ascii="Calibri" w:eastAsia="Times New Roman" w:hAnsi="Calibri" w:cs="Calibri"/>
-          <w:color w:val="1A1A1A"/>
-          <w:sz w:val="22"/>
-          <w:szCs w:val="22"/>
-          <w:lang w:val="en"/>
-        </w:rPr>
-        <w:t xml:space="preserve"> </w:t>
-      </w:r>
-      <w:r>
-        <w:rPr>
-          <w:rFonts w:ascii="Calibri" w:eastAsia="Times New Roman" w:hAnsi="Calibri" w:cs="Calibri"/>
-          <w:color w:val="1A1A1A"/>
-          <w:sz w:val="22"/>
-          <w:szCs w:val="22"/>
-          <w:lang w:val="en"/>
-        </w:rPr>
-        <w:t>-- error messages, DFM captions and SQL exception text, with exact-phrase, any-order and substring matching.</w:t>
+        <w:t>.</w:t>
+      </w:r>
+      <w:proofErr w:type="spellStart"/>
+      <w:r>
+        <w:rPr>
+          <w:rStyle w:val="HTMLCode"/>
+          <w:color w:val="1A1A1A"/>
+          <w:lang w:val="en"/>
+        </w:rPr>
+        <w:t>sql</w:t>
+      </w:r>
+      <w:proofErr w:type="spellEnd"/>
+      <w:r>
+        <w:rPr>
+          <w:rFonts w:ascii="Calibri" w:eastAsia="Times New Roman" w:hAnsi="Calibri" w:cs="Calibri"/>
+          <w:color w:val="1A1A1A"/>
+          <w:sz w:val="22"/>
+          <w:szCs w:val="22"/>
+          <w:lang w:val="en"/>
+        </w:rPr>
+        <w:t xml:space="preserve"> -- error messages, DFM captions and SQL exception text, with exact-phrase, any-order and substring matching.</w:t>
       </w:r>
     </w:p>
     <w:p>
@@ -1080,6 +1291,7 @@
           <w:lang w:val="en"/>
         </w:rPr>
       </w:pPr>
+      <w:proofErr w:type="gramStart"/>
       <w:r>
         <w:rPr>
           <w:rFonts w:ascii="Calibri" w:eastAsia="Times New Roman" w:hAnsi="Calibri" w:cs="Calibri"/>
@@ -1090,7 +1302,20 @@
           <w:szCs w:val="22"/>
           <w:lang w:val="en"/>
         </w:rPr>
-        <w:t>Where-used / usages</w:t>
+        <w:t>Where-used</w:t>
+      </w:r>
+      <w:proofErr w:type="gramEnd"/>
+      <w:r>
+        <w:rPr>
+          <w:rFonts w:ascii="Calibri" w:eastAsia="Times New Roman" w:hAnsi="Calibri" w:cs="Calibri"/>
+          <w:b/>
+          <w:bCs/>
+          <w:color w:val="000000"/>
+          <w:sz w:val="22"/>
+          <w:szCs w:val="22"/>
+          <w:lang w:val="en"/>
+        </w:rPr>
+        <w:t xml:space="preserve"> / usages</w:t>
       </w:r>
       <w:r>
         <w:rPr>
@@ -1176,6 +1401,7 @@
           <w:color w:val="1A1A1A"/>
           <w:lang w:val="en"/>
         </w:rPr>
+        <w:lastRenderedPageBreak/>
         <w:t>3. Dependency and architecture analysis</w:t>
       </w:r>
     </w:p>
@@ -1215,17 +1441,7 @@
           <w:szCs w:val="22"/>
           <w:lang w:val="en"/>
         </w:rPr>
-        <w:t xml:space="preserve"> </w:t>
-      </w:r>
-      <w:r>
-        <w:rPr>
-          <w:rFonts w:ascii="Calibri" w:eastAsia="Times New Roman" w:hAnsi="Calibri" w:cs="Calibri"/>
-          <w:color w:val="1A1A1A"/>
-          <w:sz w:val="22"/>
-          <w:szCs w:val="22"/>
-          <w:lang w:val="en"/>
-        </w:rPr>
-        <w:t>with generated cycle reports that explain why a cycle exists and recommend a fix.</w:t>
+        <w:t xml:space="preserve"> with generated cycle reports that explain why a cycle exists and recommend a fix.</w:t>
       </w:r>
     </w:p>
     <w:p>
@@ -1371,8 +1587,22 @@
           <w:szCs w:val="22"/>
           <w:lang w:val="en"/>
         </w:rPr>
-        <w:t>Reverse call tree</w:t>
-      </w:r>
+        <w:t xml:space="preserve">Reverse call </w:t>
+      </w:r>
+      <w:proofErr w:type="gramStart"/>
+      <w:r>
+        <w:rPr>
+          <w:rFonts w:ascii="Calibri" w:eastAsia="Times New Roman" w:hAnsi="Calibri" w:cs="Calibri"/>
+          <w:b/>
+          <w:bCs/>
+          <w:color w:val="000000"/>
+          <w:sz w:val="22"/>
+          <w:szCs w:val="22"/>
+          <w:lang w:val="en"/>
+        </w:rPr>
+        <w:t>tree</w:t>
+      </w:r>
+      <w:proofErr w:type="gramEnd"/>
       <w:r>
         <w:rPr>
           <w:rFonts w:ascii="Calibri" w:eastAsia="Times New Roman" w:hAnsi="Calibri" w:cs="Calibri"/>
@@ -1498,7 +1728,29 @@
           <w:szCs w:val="22"/>
           <w:lang w:val="en"/>
         </w:rPr>
-        <w:t xml:space="preserve"> -- the public interface of a type, or a minimal self-contained compilable slice.</w:t>
+        <w:t xml:space="preserve"> -- the public interface of a type, or a minimal self-contained </w:t>
+      </w:r>
+      <w:proofErr w:type="spellStart"/>
+      <w:r>
+        <w:rPr>
+          <w:rFonts w:ascii="Calibri" w:eastAsia="Times New Roman" w:hAnsi="Calibri" w:cs="Calibri"/>
+          <w:color w:val="1A1A1A"/>
+          <w:sz w:val="22"/>
+          <w:szCs w:val="22"/>
+          <w:lang w:val="en"/>
+        </w:rPr>
+        <w:t>compilable</w:t>
+      </w:r>
+      <w:proofErr w:type="spellEnd"/>
+      <w:r>
+        <w:rPr>
+          <w:rFonts w:ascii="Calibri" w:eastAsia="Times New Roman" w:hAnsi="Calibri" w:cs="Calibri"/>
+          <w:color w:val="1A1A1A"/>
+          <w:sz w:val="22"/>
+          <w:szCs w:val="22"/>
+          <w:lang w:val="en"/>
+        </w:rPr>
+        <w:t xml:space="preserve"> slice.</w:t>
       </w:r>
     </w:p>
     <w:p>
@@ -1591,7 +1843,18 @@
           <w:szCs w:val="22"/>
           <w:lang w:val="en"/>
         </w:rPr>
-        <w:t xml:space="preserve"> -- 128 built-in and 53 external </w:t>
+        <w:t xml:space="preserve"> -- 128 built-in and 53 </w:t>
+      </w:r>
+      <w:proofErr w:type="gramStart"/>
+      <w:r>
+        <w:rPr>
+          <w:rFonts w:ascii="Calibri" w:hAnsi="Calibri" w:cs="Calibri"/>
+          <w:color w:val="1A1A1A"/>
+          <w:sz w:val="22"/>
+          <w:szCs w:val="22"/>
+          <w:lang w:val="en"/>
+        </w:rPr>
+        <w:t xml:space="preserve">external </w:t>
       </w:r>
       <w:r>
         <w:rPr>
@@ -1599,8 +1862,19 @@
           <w:color w:val="1A1A1A"/>
           <w:lang w:val="en"/>
         </w:rPr>
-        <w:t>.scm</w:t>
-      </w:r>
+        <w:t>.</w:t>
+      </w:r>
+      <w:proofErr w:type="spellStart"/>
+      <w:r>
+        <w:rPr>
+          <w:rStyle w:val="HTMLCode"/>
+          <w:color w:val="1A1A1A"/>
+          <w:lang w:val="en"/>
+        </w:rPr>
+        <w:t>scm</w:t>
+      </w:r>
+      <w:proofErr w:type="spellEnd"/>
+      <w:proofErr w:type="gramEnd"/>
       <w:r>
         <w:rPr>
           <w:rFonts w:ascii="Calibri" w:hAnsi="Calibri" w:cs="Calibri"/>
@@ -1653,8 +1927,9 @@
           <w:szCs w:val="22"/>
           <w:lang w:val="en"/>
         </w:rPr>
-        <w:t xml:space="preserve">. Rules can be enabled, disabled, re-prioritised and parameterised per </w:t>
-      </w:r>
+        <w:t>. Rules can be enabled, disabled, re-</w:t>
+      </w:r>
+      <w:proofErr w:type="spellStart"/>
       <w:r>
         <w:rPr>
           <w:rFonts w:ascii="Calibri" w:hAnsi="Calibri" w:cs="Calibri"/>
@@ -1663,7 +1938,40 @@
           <w:szCs w:val="22"/>
           <w:lang w:val="en"/>
         </w:rPr>
-        <w:t>project; individual findings can be suppressed with an accountable, reviewed annotation rather than silently ignored.</w:t>
+        <w:t>prioritised</w:t>
+      </w:r>
+      <w:proofErr w:type="spellEnd"/>
+      <w:r>
+        <w:rPr>
+          <w:rFonts w:ascii="Calibri" w:hAnsi="Calibri" w:cs="Calibri"/>
+          <w:color w:val="1A1A1A"/>
+          <w:sz w:val="22"/>
+          <w:szCs w:val="22"/>
+          <w:lang w:val="en"/>
+        </w:rPr>
+        <w:t xml:space="preserve"> and </w:t>
+      </w:r>
+      <w:proofErr w:type="spellStart"/>
+      <w:r>
+        <w:rPr>
+          <w:rFonts w:ascii="Calibri" w:hAnsi="Calibri" w:cs="Calibri"/>
+          <w:color w:val="1A1A1A"/>
+          <w:sz w:val="22"/>
+          <w:szCs w:val="22"/>
+          <w:lang w:val="en"/>
+        </w:rPr>
+        <w:t>parameterised</w:t>
+      </w:r>
+      <w:proofErr w:type="spellEnd"/>
+      <w:r>
+        <w:rPr>
+          <w:rFonts w:ascii="Calibri" w:hAnsi="Calibri" w:cs="Calibri"/>
+          <w:color w:val="1A1A1A"/>
+          <w:sz w:val="22"/>
+          <w:szCs w:val="22"/>
+          <w:lang w:val="en"/>
+        </w:rPr>
+        <w:t xml:space="preserve"> per project; individual findings can be suppressed with an accountable, reviewed annotation rather than silently ignored.</w:t>
       </w:r>
     </w:p>
     <w:tbl>
@@ -1678,9 +1986,9 @@
         <w:tblLook w:val="04A0" w:firstRow="1" w:lastRow="0" w:firstColumn="1" w:lastColumn="0" w:noHBand="0" w:noVBand="1"/>
       </w:tblPr>
       <w:tblGrid>
-        <w:gridCol w:w="1983"/>
+        <w:gridCol w:w="2133"/>
         <w:gridCol w:w="960"/>
-        <w:gridCol w:w="6401"/>
+        <w:gridCol w:w="8267"/>
       </w:tblGrid>
       <w:tr>
         <w:trPr>
@@ -1981,6 +2289,7 @@
               </w:rPr>
               <w:t xml:space="preserve"> calls, </w:t>
             </w:r>
+            <w:proofErr w:type="spellStart"/>
             <w:r>
               <w:rPr>
                 <w:rStyle w:val="HTMLCode"/>
@@ -1988,23 +2297,15 @@
               </w:rPr>
               <w:t>FreeAndNil</w:t>
             </w:r>
-            <w:r>
-              <w:rPr>
-                <w:rFonts w:ascii="Calibri" w:eastAsia="Times New Roman" w:hAnsi="Calibri" w:cs="Calibri"/>
-                <w:color w:val="1A1A1A"/>
-                <w:sz w:val="21"/>
-                <w:szCs w:val="21"/>
-              </w:rPr>
-              <w:t xml:space="preserve"> </w:t>
-            </w:r>
-            <w:r>
-              <w:rPr>
-                <w:rFonts w:ascii="Calibri" w:eastAsia="Times New Roman" w:hAnsi="Calibri" w:cs="Calibri"/>
-                <w:color w:val="1A1A1A"/>
-                <w:sz w:val="21"/>
-                <w:szCs w:val="21"/>
-              </w:rPr>
-              <w:t>on an interface, object/interface dual-handle mixing, unreleased critical sections, virtual calls from a constructor, instantiating a class with an unimplemented abstract method</w:t>
+            <w:proofErr w:type="spellEnd"/>
+            <w:r>
+              <w:rPr>
+                <w:rFonts w:ascii="Calibri" w:eastAsia="Times New Roman" w:hAnsi="Calibri" w:cs="Calibri"/>
+                <w:color w:val="1A1A1A"/>
+                <w:sz w:val="21"/>
+                <w:szCs w:val="21"/>
+              </w:rPr>
+              <w:t xml:space="preserve"> on an interface, object/interface dual-handle mixing, unreleased critical sections, virtual calls from a constructor, instantiating a class with an unimplemented abstract method</w:t>
             </w:r>
           </w:p>
         </w:tc>
@@ -2390,12 +2691,21 @@
               </w:rPr>
               <w:t xml:space="preserve">), comparisons that are always true or always false, identical operands, self-assignment, off-by-one loop bounds, float equality, string and case-insensitive comparison mistakes, division by literal zero, </w:t>
             </w:r>
+            <w:proofErr w:type="gramStart"/>
             <w:r>
               <w:rPr>
                 <w:rStyle w:val="HTMLCode"/>
                 <w:color w:val="1A1A1A"/>
               </w:rPr>
-              <w:t>Format()</w:t>
+              <w:t>Format(</w:t>
+            </w:r>
+            <w:proofErr w:type="gramEnd"/>
+            <w:r>
+              <w:rPr>
+                <w:rStyle w:val="HTMLCode"/>
+                <w:color w:val="1A1A1A"/>
+              </w:rPr>
+              <w:t>)</w:t>
             </w:r>
             <w:r>
               <w:rPr>
@@ -2420,16 +2730,27 @@
                 <w:sz w:val="21"/>
                 <w:szCs w:val="21"/>
               </w:rPr>
-              <w:t xml:space="preserve"> </w:t>
-            </w:r>
-            <w:r>
-              <w:rPr>
-                <w:rFonts w:ascii="Calibri" w:eastAsia="Times New Roman" w:hAnsi="Calibri" w:cs="Calibri"/>
-                <w:color w:val="1A1A1A"/>
-                <w:sz w:val="21"/>
-                <w:szCs w:val="21"/>
-              </w:rPr>
-              <w:t>on an enum, unguarded hard casts, lossy Unicode-to-Ansi casts</w:t>
+              <w:t xml:space="preserve"> on an </w:t>
+            </w:r>
+            <w:proofErr w:type="spellStart"/>
+            <w:r>
+              <w:rPr>
+                <w:rFonts w:ascii="Calibri" w:eastAsia="Times New Roman" w:hAnsi="Calibri" w:cs="Calibri"/>
+                <w:color w:val="1A1A1A"/>
+                <w:sz w:val="21"/>
+                <w:szCs w:val="21"/>
+              </w:rPr>
+              <w:t>enum</w:t>
+            </w:r>
+            <w:proofErr w:type="spellEnd"/>
+            <w:r>
+              <w:rPr>
+                <w:rFonts w:ascii="Calibri" w:eastAsia="Times New Roman" w:hAnsi="Calibri" w:cs="Calibri"/>
+                <w:color w:val="1A1A1A"/>
+                <w:sz w:val="21"/>
+                <w:szCs w:val="21"/>
+              </w:rPr>
+              <w:t>, unguarded hard casts, lossy Unicode-to-Ansi casts</w:t>
             </w:r>
           </w:p>
         </w:tc>
@@ -3322,7 +3643,29 @@
           <w:szCs w:val="22"/>
           <w:lang w:val="en"/>
         </w:rPr>
-        <w:t xml:space="preserve"> -- single file, or whole project. Project-wide rules can only fire in a whole-project run.</w:t>
+        <w:t xml:space="preserve"> -- single file, or whole project. Project-wide rules can only fire in a </w:t>
+      </w:r>
+      <w:proofErr w:type="gramStart"/>
+      <w:r>
+        <w:rPr>
+          <w:rFonts w:ascii="Calibri" w:eastAsia="Times New Roman" w:hAnsi="Calibri" w:cs="Calibri"/>
+          <w:color w:val="1A1A1A"/>
+          <w:sz w:val="22"/>
+          <w:szCs w:val="22"/>
+          <w:lang w:val="en"/>
+        </w:rPr>
+        <w:t>whole-project</w:t>
+      </w:r>
+      <w:proofErr w:type="gramEnd"/>
+      <w:r>
+        <w:rPr>
+          <w:rFonts w:ascii="Calibri" w:eastAsia="Times New Roman" w:hAnsi="Calibri" w:cs="Calibri"/>
+          <w:color w:val="1A1A1A"/>
+          <w:sz w:val="22"/>
+          <w:szCs w:val="22"/>
+          <w:lang w:val="en"/>
+        </w:rPr>
+        <w:t xml:space="preserve"> run.</w:t>
       </w:r>
     </w:p>
     <w:p>
@@ -3400,7 +3743,29 @@
           <w:szCs w:val="22"/>
           <w:lang w:val="en"/>
         </w:rPr>
-        <w:t xml:space="preserve"> -- error, warning, info and hint, mapped to the IDE's own colour scheme.</w:t>
+        <w:t xml:space="preserve"> -- error, warning, info and hint, mapped to the IDE's own </w:t>
+      </w:r>
+      <w:proofErr w:type="spellStart"/>
+      <w:r>
+        <w:rPr>
+          <w:rFonts w:ascii="Calibri" w:eastAsia="Times New Roman" w:hAnsi="Calibri" w:cs="Calibri"/>
+          <w:color w:val="1A1A1A"/>
+          <w:sz w:val="22"/>
+          <w:szCs w:val="22"/>
+          <w:lang w:val="en"/>
+        </w:rPr>
+        <w:t>colour</w:t>
+      </w:r>
+      <w:proofErr w:type="spellEnd"/>
+      <w:r>
+        <w:rPr>
+          <w:rFonts w:ascii="Calibri" w:eastAsia="Times New Roman" w:hAnsi="Calibri" w:cs="Calibri"/>
+          <w:color w:val="1A1A1A"/>
+          <w:sz w:val="22"/>
+          <w:szCs w:val="22"/>
+          <w:lang w:val="en"/>
+        </w:rPr>
+        <w:t xml:space="preserve"> scheme.</w:t>
       </w:r>
     </w:p>
     <w:p>
@@ -3478,7 +3843,29 @@
           <w:szCs w:val="22"/>
           <w:lang w:val="en"/>
         </w:rPr>
-        <w:t xml:space="preserve"> -- vendored and third-party roots are reported as skipped by name, never silently dropped from the count.</w:t>
+        <w:t xml:space="preserve"> -- </w:t>
+      </w:r>
+      <w:proofErr w:type="spellStart"/>
+      <w:r>
+        <w:rPr>
+          <w:rFonts w:ascii="Calibri" w:eastAsia="Times New Roman" w:hAnsi="Calibri" w:cs="Calibri"/>
+          <w:color w:val="1A1A1A"/>
+          <w:sz w:val="22"/>
+          <w:szCs w:val="22"/>
+          <w:lang w:val="en"/>
+        </w:rPr>
+        <w:t>vendored</w:t>
+      </w:r>
+      <w:proofErr w:type="spellEnd"/>
+      <w:r>
+        <w:rPr>
+          <w:rFonts w:ascii="Calibri" w:eastAsia="Times New Roman" w:hAnsi="Calibri" w:cs="Calibri"/>
+          <w:color w:val="1A1A1A"/>
+          <w:sz w:val="22"/>
+          <w:szCs w:val="22"/>
+          <w:lang w:val="en"/>
+        </w:rPr>
+        <w:t xml:space="preserve"> and third-party roots are reported as skipped by name, never silently dropped from the count.</w:t>
       </w:r>
     </w:p>
     <w:p>
@@ -3611,7 +3998,29 @@
           <w:szCs w:val="22"/>
           <w:lang w:val="en"/>
         </w:rPr>
-        <w:t xml:space="preserve"> -- spawns the real compiler against a file or project and returns hints, warnings, errors and fatals as JSON.</w:t>
+        <w:t xml:space="preserve"> -- spawns the real compiler against a file or project and returns hints, warnings, errors and </w:t>
+      </w:r>
+      <w:proofErr w:type="spellStart"/>
+      <w:r>
+        <w:rPr>
+          <w:rFonts w:ascii="Calibri" w:eastAsia="Times New Roman" w:hAnsi="Calibri" w:cs="Calibri"/>
+          <w:color w:val="1A1A1A"/>
+          <w:sz w:val="22"/>
+          <w:szCs w:val="22"/>
+          <w:lang w:val="en"/>
+        </w:rPr>
+        <w:t>fatals</w:t>
+      </w:r>
+      <w:proofErr w:type="spellEnd"/>
+      <w:r>
+        <w:rPr>
+          <w:rFonts w:ascii="Calibri" w:eastAsia="Times New Roman" w:hAnsi="Calibri" w:cs="Calibri"/>
+          <w:color w:val="1A1A1A"/>
+          <w:sz w:val="22"/>
+          <w:szCs w:val="22"/>
+          <w:lang w:val="en"/>
+        </w:rPr>
+        <w:t xml:space="preserve"> as JSON.</w:t>
       </w:r>
     </w:p>
     <w:p>
@@ -3650,17 +4059,7 @@
           <w:szCs w:val="22"/>
           <w:lang w:val="en"/>
         </w:rPr>
-        <w:t xml:space="preserve"> </w:t>
-      </w:r>
-      <w:r>
-        <w:rPr>
-          <w:rFonts w:ascii="Calibri" w:eastAsia="Times New Roman" w:hAnsi="Calibri" w:cs="Calibri"/>
-          <w:color w:val="1A1A1A"/>
-          <w:sz w:val="22"/>
-          <w:szCs w:val="22"/>
-          <w:lang w:val="en"/>
-        </w:rPr>
-        <w:t>-- compiles what is currently in the editor, in a separate process, so real compiler errors appear as you type without saving and without freezing the IDE. Your source files are never written: each unsaved buffer is staged into a temporary shadow directory and compiled there, in full project context, so the editor stays the single source of truth and no "changed on disk" prompt can appear.</w:t>
+        <w:t xml:space="preserve"> -- compiles what is currently in the editor, in a separate process, so real compiler errors appear as you type without saving and without freezing the IDE. Your source files are never written: each unsaved buffer is staged into a temporary shadow directory and compiled there, in full project context, so the editor stays the single source of truth and no "changed on disk" prompt can appear.</w:t>
       </w:r>
     </w:p>
     <w:p>
@@ -3738,17 +4137,7 @@
           <w:szCs w:val="22"/>
           <w:lang w:val="en"/>
         </w:rPr>
-        <w:t xml:space="preserve"> </w:t>
-      </w:r>
-      <w:r>
-        <w:rPr>
-          <w:rFonts w:ascii="Calibri" w:eastAsia="Times New Roman" w:hAnsi="Calibri" w:cs="Calibri"/>
-          <w:color w:val="1A1A1A"/>
-          <w:sz w:val="22"/>
-          <w:szCs w:val="22"/>
-          <w:lang w:val="en"/>
-        </w:rPr>
-        <w:t>-- conditional-compilation branches are resolved so inactive code is not misread as active.</w:t>
+        <w:t xml:space="preserve"> -- conditional-compilation branches are resolved so inactive code is not misread as active.</w:t>
       </w:r>
     </w:p>
     <w:p>
@@ -3786,6 +4175,7 @@
           <w:lang w:val="en"/>
         </w:rPr>
       </w:pPr>
+      <w:proofErr w:type="spellStart"/>
       <w:r>
         <w:rPr>
           <w:rFonts w:ascii="Calibri" w:eastAsia="Times New Roman" w:hAnsi="Calibri" w:cs="Calibri"/>
@@ -3796,7 +4186,20 @@
           <w:szCs w:val="22"/>
           <w:lang w:val="en"/>
         </w:rPr>
-        <w:t>DocInsight support</w:t>
+        <w:t>DocInsight</w:t>
+      </w:r>
+      <w:proofErr w:type="spellEnd"/>
+      <w:r>
+        <w:rPr>
+          <w:rFonts w:ascii="Calibri" w:eastAsia="Times New Roman" w:hAnsi="Calibri" w:cs="Calibri"/>
+          <w:b/>
+          <w:bCs/>
+          <w:color w:val="000000"/>
+          <w:sz w:val="22"/>
+          <w:szCs w:val="22"/>
+          <w:lang w:val="en"/>
+        </w:rPr>
+        <w:t xml:space="preserve"> support</w:t>
       </w:r>
       <w:r>
         <w:rPr>
@@ -4302,7 +4705,33 @@
           <w:szCs w:val="22"/>
           <w:lang w:val="en"/>
         </w:rPr>
-        <w:t>Uses-clause quick fixes</w:t>
+        <w:t xml:space="preserve">Uses-clause </w:t>
+      </w:r>
+      <w:proofErr w:type="gramStart"/>
+      <w:r>
+        <w:rPr>
+          <w:rFonts w:ascii="Calibri" w:eastAsia="Times New Roman" w:hAnsi="Calibri" w:cs="Calibri"/>
+          <w:b/>
+          <w:bCs/>
+          <w:color w:val="000000"/>
+          <w:sz w:val="22"/>
+          <w:szCs w:val="22"/>
+          <w:lang w:val="en"/>
+        </w:rPr>
+        <w:t>quick</w:t>
+      </w:r>
+      <w:proofErr w:type="gramEnd"/>
+      <w:r>
+        <w:rPr>
+          <w:rFonts w:ascii="Calibri" w:eastAsia="Times New Roman" w:hAnsi="Calibri" w:cs="Calibri"/>
+          <w:b/>
+          <w:bCs/>
+          <w:color w:val="000000"/>
+          <w:sz w:val="22"/>
+          <w:szCs w:val="22"/>
+          <w:lang w:val="en"/>
+        </w:rPr>
+        <w:t xml:space="preserve"> fixes</w:t>
       </w:r>
       <w:r>
         <w:rPr>
@@ -4380,8 +4809,22 @@
           <w:szCs w:val="22"/>
           <w:lang w:val="en"/>
         </w:rPr>
-        <w:t>Exception-class synchronisation</w:t>
-      </w:r>
+        <w:t xml:space="preserve">Exception-class </w:t>
+      </w:r>
+      <w:proofErr w:type="spellStart"/>
+      <w:r>
+        <w:rPr>
+          <w:rFonts w:ascii="Calibri" w:eastAsia="Times New Roman" w:hAnsi="Calibri" w:cs="Calibri"/>
+          <w:b/>
+          <w:bCs/>
+          <w:color w:val="000000"/>
+          <w:sz w:val="22"/>
+          <w:szCs w:val="22"/>
+          <w:lang w:val="en"/>
+        </w:rPr>
+        <w:t>synchronisation</w:t>
+      </w:r>
+      <w:proofErr w:type="spellEnd"/>
       <w:r>
         <w:rPr>
           <w:rFonts w:ascii="Calibri" w:eastAsia="Times New Roman" w:hAnsi="Calibri" w:cs="Calibri"/>
@@ -4580,17 +5023,7 @@
           <w:szCs w:val="22"/>
           <w:lang w:val="en"/>
         </w:rPr>
-        <w:t xml:space="preserve"> -- assembles exactly what an AI assistant needs to work on a symbol (documentation, class surface, the symbol's own body, and a capped </w:t>
-      </w:r>
-      <w:r>
-        <w:rPr>
-          <w:rFonts w:ascii="Calibri" w:hAnsi="Calibri" w:cs="Calibri"/>
-          <w:color w:val="1A1A1A"/>
-          <w:sz w:val="22"/>
-          <w:szCs w:val="22"/>
-          <w:lang w:val="en"/>
-        </w:rPr>
-        <w:t xml:space="preserve">set of callers) instead of whole source files. Measured roughly </w:t>
+        <w:t xml:space="preserve"> -- assembles exactly what an AI assistant needs to work on a symbol (documentation, class surface, the symbol's own body, and a capped set of callers) instead of whole source files. Measured roughly </w:t>
       </w:r>
       <w:r>
         <w:rPr>
@@ -4658,7 +5091,29 @@
           <w:szCs w:val="22"/>
           <w:lang w:val="en"/>
         </w:rPr>
-        <w:t>Across a working day that is the difference between an assistant that is affordable to run against a large Delphi codebase and one that is not.</w:t>
+        <w:t xml:space="preserve">Across a working </w:t>
+      </w:r>
+      <w:proofErr w:type="gramStart"/>
+      <w:r>
+        <w:rPr>
+          <w:rFonts w:ascii="Calibri" w:hAnsi="Calibri" w:cs="Calibri"/>
+          <w:color w:val="1A1A1A"/>
+          <w:sz w:val="22"/>
+          <w:szCs w:val="22"/>
+          <w:lang w:val="en"/>
+        </w:rPr>
+        <w:t>day</w:t>
+      </w:r>
+      <w:proofErr w:type="gramEnd"/>
+      <w:r>
+        <w:rPr>
+          <w:rFonts w:ascii="Calibri" w:hAnsi="Calibri" w:cs="Calibri"/>
+          <w:color w:val="1A1A1A"/>
+          <w:sz w:val="22"/>
+          <w:szCs w:val="22"/>
+          <w:lang w:val="en"/>
+        </w:rPr>
+        <w:t xml:space="preserve"> that is the difference between an assistant that is affordable to run against a large Delphi codebase and one that is not.</w:t>
       </w:r>
     </w:p>
     <w:p>
@@ -4697,17 +5152,29 @@
           <w:szCs w:val="22"/>
           <w:lang w:val="en"/>
         </w:rPr>
-        <w:t xml:space="preserve"> </w:t>
-      </w:r>
-      <w:r>
-        <w:rPr>
-          <w:rFonts w:ascii="Calibri" w:eastAsia="Times New Roman" w:hAnsi="Calibri" w:cs="Calibri"/>
-          <w:color w:val="1A1A1A"/>
-          <w:sz w:val="22"/>
-          <w:szCs w:val="22"/>
-          <w:lang w:val="en"/>
-        </w:rPr>
-        <w:t>for Claude, Cursor and other MCP clients -- symbol lookup, callers, linting, documentation, doc-tag and undocumented search, impact, DI wiring, class surface, code slice, context bundle, type-at-position, rename, AST checks and compile check.</w:t>
+        <w:t xml:space="preserve"> for Claude, Cursor and other MCP clients -- symbol lookup, callers, linting, documentation, doc-tag and undocumented search, impact, DI wiring, class surface, code slice, context bundle, type-at-position, rename, AST checks and compile </w:t>
+      </w:r>
+      <w:proofErr w:type="gramStart"/>
+      <w:r>
+        <w:rPr>
+          <w:rFonts w:ascii="Calibri" w:eastAsia="Times New Roman" w:hAnsi="Calibri" w:cs="Calibri"/>
+          <w:color w:val="1A1A1A"/>
+          <w:sz w:val="22"/>
+          <w:szCs w:val="22"/>
+          <w:lang w:val="en"/>
+        </w:rPr>
+        <w:t>check</w:t>
+      </w:r>
+      <w:proofErr w:type="gramEnd"/>
+      <w:r>
+        <w:rPr>
+          <w:rFonts w:ascii="Calibri" w:eastAsia="Times New Roman" w:hAnsi="Calibri" w:cs="Calibri"/>
+          <w:color w:val="1A1A1A"/>
+          <w:sz w:val="22"/>
+          <w:szCs w:val="22"/>
+          <w:lang w:val="en"/>
+        </w:rPr>
+        <w:t>.</w:t>
       </w:r>
     </w:p>
     <w:p>
@@ -4904,17 +5371,7 @@
           <w:szCs w:val="22"/>
           <w:lang w:val="en"/>
         </w:rPr>
-        <w:t xml:space="preserve"> </w:t>
-      </w:r>
-      <w:r>
-        <w:rPr>
-          <w:rFonts w:ascii="Calibri" w:eastAsia="Times New Roman" w:hAnsi="Calibri" w:cs="Calibri"/>
-          <w:color w:val="1A1A1A"/>
-          <w:sz w:val="22"/>
-          <w:szCs w:val="22"/>
-          <w:lang w:val="en"/>
-        </w:rPr>
-        <w:t>-- hover, go-to-definition, find-references, workspace symbols, completion and signature help, answered from the index across every project at once, with no compiler and no project open. Find-references and workspace symbols are not available from Delphi's own language server at all.</w:t>
+        <w:t xml:space="preserve"> -- hover, go-to-definition, find-references, workspace symbols, completion and signature help, answered from the index across every project at once, with no compiler and no project open. Find-references and workspace symbols are not available from Delphi's own language server at all.</w:t>
       </w:r>
     </w:p>
     <w:p>
@@ -5010,7 +5467,29 @@
           <w:szCs w:val="22"/>
           <w:lang w:val="en"/>
         </w:rPr>
-        <w:t xml:space="preserve"> -- 66 entry points across four surfaces: 50 main-menu items, 2 tool windows, 13 on the Structure view's right-click menu, and 1 on the Project Manager. Includes 12 Ctrl+Alt shortcuts.</w:t>
+        <w:t xml:space="preserve"> -- 66 entry points across four surfaces: 50 main-menu items, 2 tool windows, 13 on the Structure view's right-click menu, and 1 on the Project Manager. Includes 12 </w:t>
+      </w:r>
+      <w:proofErr w:type="spellStart"/>
+      <w:r>
+        <w:rPr>
+          <w:rFonts w:ascii="Calibri" w:eastAsia="Times New Roman" w:hAnsi="Calibri" w:cs="Calibri"/>
+          <w:color w:val="1A1A1A"/>
+          <w:sz w:val="22"/>
+          <w:szCs w:val="22"/>
+          <w:lang w:val="en"/>
+        </w:rPr>
+        <w:t>Ctrl+Alt</w:t>
+      </w:r>
+      <w:proofErr w:type="spellEnd"/>
+      <w:r>
+        <w:rPr>
+          <w:rFonts w:ascii="Calibri" w:eastAsia="Times New Roman" w:hAnsi="Calibri" w:cs="Calibri"/>
+          <w:color w:val="1A1A1A"/>
+          <w:sz w:val="22"/>
+          <w:szCs w:val="22"/>
+          <w:lang w:val="en"/>
+        </w:rPr>
+        <w:t xml:space="preserve"> shortcuts.</w:t>
       </w:r>
     </w:p>
     <w:p>
@@ -5049,7 +5528,29 @@
           <w:szCs w:val="22"/>
           <w:lang w:val="en"/>
         </w:rPr>
-        <w:t xml:space="preserve"> -- gutter markers and wavy underlines, coloured from the IDE's own scheme, with hover tooltips.</w:t>
+        <w:t xml:space="preserve"> -- gutter markers and wavy underlines, </w:t>
+      </w:r>
+      <w:proofErr w:type="spellStart"/>
+      <w:r>
+        <w:rPr>
+          <w:rFonts w:ascii="Calibri" w:eastAsia="Times New Roman" w:hAnsi="Calibri" w:cs="Calibri"/>
+          <w:color w:val="1A1A1A"/>
+          <w:sz w:val="22"/>
+          <w:szCs w:val="22"/>
+          <w:lang w:val="en"/>
+        </w:rPr>
+        <w:t>coloured</w:t>
+      </w:r>
+      <w:proofErr w:type="spellEnd"/>
+      <w:r>
+        <w:rPr>
+          <w:rFonts w:ascii="Calibri" w:eastAsia="Times New Roman" w:hAnsi="Calibri" w:cs="Calibri"/>
+          <w:color w:val="1A1A1A"/>
+          <w:sz w:val="22"/>
+          <w:szCs w:val="22"/>
+          <w:lang w:val="en"/>
+        </w:rPr>
+        <w:t xml:space="preserve"> from the IDE's own scheme, with hover tooltips.</w:t>
       </w:r>
     </w:p>
     <w:p>
@@ -5068,6 +5569,7 @@
           <w:lang w:val="en"/>
         </w:rPr>
       </w:pPr>
+      <w:proofErr w:type="spellStart"/>
       <w:r>
         <w:rPr>
           <w:rFonts w:ascii="Calibri" w:eastAsia="Times New Roman" w:hAnsi="Calibri" w:cs="Calibri"/>
@@ -5078,7 +5580,20 @@
           <w:szCs w:val="22"/>
           <w:lang w:val="en"/>
         </w:rPr>
-        <w:t>Dockable panels</w:t>
+        <w:t>Dockable</w:t>
+      </w:r>
+      <w:proofErr w:type="spellEnd"/>
+      <w:r>
+        <w:rPr>
+          <w:rFonts w:ascii="Calibri" w:eastAsia="Times New Roman" w:hAnsi="Calibri" w:cs="Calibri"/>
+          <w:b/>
+          <w:bCs/>
+          <w:color w:val="000000"/>
+          <w:sz w:val="22"/>
+          <w:szCs w:val="22"/>
+          <w:lang w:val="en"/>
+        </w:rPr>
+        <w:t xml:space="preserve"> panels</w:t>
       </w:r>
       <w:r>
         <w:rPr>
@@ -5127,17 +5642,95 @@
           <w:szCs w:val="22"/>
           <w:lang w:val="en"/>
         </w:rPr>
-        <w:t xml:space="preserve"> -- fi</w:t>
-      </w:r>
-      <w:r>
-        <w:rPr>
-          <w:rFonts w:ascii="Calibri" w:eastAsia="Times New Roman" w:hAnsi="Calibri" w:cs="Calibri"/>
-          <w:color w:val="1A1A1A"/>
-          <w:sz w:val="22"/>
-          <w:szCs w:val="22"/>
-          <w:lang w:val="en"/>
-        </w:rPr>
-        <w:t>ndings in the Problems panel on save, a Pascal TextMate grammar, and a colour theme generated from your own RAD Studio scheme so colours match the IDE literally rather than approximately. It runs a private copy of the engine, so an open window never blocks a rebuild.</w:t>
+        <w:t xml:space="preserve"> -- findings in the Problems panel on save, </w:t>
+      </w:r>
+      <w:proofErr w:type="gramStart"/>
+      <w:r>
+        <w:rPr>
+          <w:rFonts w:ascii="Calibri" w:eastAsia="Times New Roman" w:hAnsi="Calibri" w:cs="Calibri"/>
+          <w:color w:val="1A1A1A"/>
+          <w:sz w:val="22"/>
+          <w:szCs w:val="22"/>
+          <w:lang w:val="en"/>
+        </w:rPr>
+        <w:t>a Pascal</w:t>
+      </w:r>
+      <w:proofErr w:type="gramEnd"/>
+      <w:r>
+        <w:rPr>
+          <w:rFonts w:ascii="Calibri" w:eastAsia="Times New Roman" w:hAnsi="Calibri" w:cs="Calibri"/>
+          <w:color w:val="1A1A1A"/>
+          <w:sz w:val="22"/>
+          <w:szCs w:val="22"/>
+          <w:lang w:val="en"/>
+        </w:rPr>
+        <w:t xml:space="preserve"> </w:t>
+      </w:r>
+      <w:proofErr w:type="spellStart"/>
+      <w:r>
+        <w:rPr>
+          <w:rFonts w:ascii="Calibri" w:eastAsia="Times New Roman" w:hAnsi="Calibri" w:cs="Calibri"/>
+          <w:color w:val="1A1A1A"/>
+          <w:sz w:val="22"/>
+          <w:szCs w:val="22"/>
+          <w:lang w:val="en"/>
+        </w:rPr>
+        <w:t>TextMate</w:t>
+      </w:r>
+      <w:proofErr w:type="spellEnd"/>
+      <w:r>
+        <w:rPr>
+          <w:rFonts w:ascii="Calibri" w:eastAsia="Times New Roman" w:hAnsi="Calibri" w:cs="Calibri"/>
+          <w:color w:val="1A1A1A"/>
+          <w:sz w:val="22"/>
+          <w:szCs w:val="22"/>
+          <w:lang w:val="en"/>
+        </w:rPr>
+        <w:t xml:space="preserve"> grammar, and a </w:t>
+      </w:r>
+      <w:proofErr w:type="spellStart"/>
+      <w:r>
+        <w:rPr>
+          <w:rFonts w:ascii="Calibri" w:eastAsia="Times New Roman" w:hAnsi="Calibri" w:cs="Calibri"/>
+          <w:color w:val="1A1A1A"/>
+          <w:sz w:val="22"/>
+          <w:szCs w:val="22"/>
+          <w:lang w:val="en"/>
+        </w:rPr>
+        <w:t>colour</w:t>
+      </w:r>
+      <w:proofErr w:type="spellEnd"/>
+      <w:r>
+        <w:rPr>
+          <w:rFonts w:ascii="Calibri" w:eastAsia="Times New Roman" w:hAnsi="Calibri" w:cs="Calibri"/>
+          <w:color w:val="1A1A1A"/>
+          <w:sz w:val="22"/>
+          <w:szCs w:val="22"/>
+          <w:lang w:val="en"/>
+        </w:rPr>
+        <w:t xml:space="preserve"> theme generated from your own RAD Studio scheme so </w:t>
+      </w:r>
+      <w:proofErr w:type="spellStart"/>
+      <w:r>
+        <w:rPr>
+          <w:rFonts w:ascii="Calibri" w:eastAsia="Times New Roman" w:hAnsi="Calibri" w:cs="Calibri"/>
+          <w:color w:val="1A1A1A"/>
+          <w:sz w:val="22"/>
+          <w:szCs w:val="22"/>
+          <w:lang w:val="en"/>
+        </w:rPr>
+        <w:t>colours</w:t>
+      </w:r>
+      <w:proofErr w:type="spellEnd"/>
+      <w:r>
+        <w:rPr>
+          <w:rFonts w:ascii="Calibri" w:eastAsia="Times New Roman" w:hAnsi="Calibri" w:cs="Calibri"/>
+          <w:color w:val="1A1A1A"/>
+          <w:sz w:val="22"/>
+          <w:szCs w:val="22"/>
+          <w:lang w:val="en"/>
+        </w:rPr>
+        <w:t xml:space="preserve"> match the IDE literally rather than approximately. It runs a private copy of the engine, so an open window never blocks a rebuild.</w:t>
       </w:r>
     </w:p>
     <w:p>
@@ -5215,7 +5808,29 @@
           <w:szCs w:val="22"/>
           <w:lang w:val="en"/>
         </w:rPr>
-        <w:t xml:space="preserve"> -- Neovim, Helix and others point at the same server.</w:t>
+        <w:t xml:space="preserve"> -- </w:t>
+      </w:r>
+      <w:proofErr w:type="spellStart"/>
+      <w:r>
+        <w:rPr>
+          <w:rFonts w:ascii="Calibri" w:eastAsia="Times New Roman" w:hAnsi="Calibri" w:cs="Calibri"/>
+          <w:color w:val="1A1A1A"/>
+          <w:sz w:val="22"/>
+          <w:szCs w:val="22"/>
+          <w:lang w:val="en"/>
+        </w:rPr>
+        <w:t>Neovim</w:t>
+      </w:r>
+      <w:proofErr w:type="spellEnd"/>
+      <w:r>
+        <w:rPr>
+          <w:rFonts w:ascii="Calibri" w:eastAsia="Times New Roman" w:hAnsi="Calibri" w:cs="Calibri"/>
+          <w:color w:val="1A1A1A"/>
+          <w:sz w:val="22"/>
+          <w:szCs w:val="22"/>
+          <w:lang w:val="en"/>
+        </w:rPr>
+        <w:t>, Helix and others point at the same server.</w:t>
       </w:r>
     </w:p>
     <w:p>
@@ -5273,17 +5888,7 @@
           <w:szCs w:val="22"/>
           <w:lang w:val="en"/>
         </w:rPr>
-        <w:t xml:space="preserve"> </w:t>
-      </w:r>
-      <w:r>
-        <w:rPr>
-          <w:rFonts w:ascii="Calibri" w:eastAsia="Times New Roman" w:hAnsi="Calibri" w:cs="Calibri"/>
-          <w:color w:val="1A1A1A"/>
-          <w:sz w:val="22"/>
-          <w:szCs w:val="22"/>
-          <w:lang w:val="en"/>
-        </w:rPr>
-        <w:t>-- dead code, TODOs, compiler hints, top symbols, forms inventory, dependency and cycle reports.</w:t>
+        <w:t xml:space="preserve"> -- dead code, TODOs, compiler hints, top symbols, forms inventory, dependency and cycle reports.</w:t>
       </w:r>
     </w:p>
     <w:p>
@@ -5439,17 +6044,7 @@
           <w:szCs w:val="22"/>
           <w:lang w:val="en"/>
         </w:rPr>
-        <w:t xml:space="preserve"> </w:t>
-      </w:r>
-      <w:r>
-        <w:rPr>
-          <w:rFonts w:ascii="Calibri" w:eastAsia="Times New Roman" w:hAnsi="Calibri" w:cs="Calibri"/>
-          <w:color w:val="1A1A1A"/>
-          <w:sz w:val="22"/>
-          <w:szCs w:val="22"/>
-          <w:lang w:val="en"/>
-        </w:rPr>
-        <w:t>-- detects and restores files left modified by an interrupted operation.</w:t>
+        <w:t xml:space="preserve"> -- detects and restores files left modified by an interrupted operation.</w:t>
       </w:r>
     </w:p>
     <w:p>
@@ -5587,17 +6182,7 @@
           <w:szCs w:val="22"/>
           <w:lang w:val="en"/>
         </w:rPr>
-        <w:t xml:space="preserve"> controls, or BDE data access) to modern replacements such as </w:t>
-      </w:r>
-      <w:r>
-        <w:rPr>
-          <w:rFonts w:ascii="Calibri" w:hAnsi="Calibri" w:cs="Calibri"/>
-          <w:color w:val="1A1A1A"/>
-          <w:sz w:val="22"/>
-          <w:szCs w:val="22"/>
-          <w:lang w:val="en"/>
-        </w:rPr>
-        <w:t>DevExpress or FireDAC -- across every surface a component touches, not just the declaration.</w:t>
+        <w:t xml:space="preserve"> controls, or BDE data access) to modern replacements such as DevExpress or FireDAC -- across every surface a component touches, not just the declaration.</w:t>
       </w:r>
     </w:p>
     <w:p>
@@ -5609,6 +6194,7 @@
           <w:lang w:val="en"/>
         </w:rPr>
       </w:pPr>
+      <w:proofErr w:type="gramStart"/>
       <w:r>
         <w:rPr>
           <w:rFonts w:ascii="Calibri" w:eastAsia="Times New Roman" w:hAnsi="Calibri" w:cs="Calibri"/>
@@ -5616,6 +6202,7 @@
         </w:rPr>
         <w:t>Conversion rules language</w:t>
       </w:r>
+      <w:proofErr w:type="gramEnd"/>
     </w:p>
     <w:p>
       <w:pPr>
@@ -5653,7 +6240,29 @@
           <w:szCs w:val="22"/>
           <w:lang w:val="en"/>
         </w:rPr>
-        <w:t>, a superset of the reFind format -- covering type conversion, property and event linking, defaults, notes, unit add/remove/swap, regular-expression rules, and reusable named value mappings.</w:t>
+        <w:t xml:space="preserve">, a superset of the </w:t>
+      </w:r>
+      <w:proofErr w:type="spellStart"/>
+      <w:r>
+        <w:rPr>
+          <w:rFonts w:ascii="Calibri" w:eastAsia="Times New Roman" w:hAnsi="Calibri" w:cs="Calibri"/>
+          <w:color w:val="1A1A1A"/>
+          <w:sz w:val="22"/>
+          <w:szCs w:val="22"/>
+          <w:lang w:val="en"/>
+        </w:rPr>
+        <w:t>reFind</w:t>
+      </w:r>
+      <w:proofErr w:type="spellEnd"/>
+      <w:r>
+        <w:rPr>
+          <w:rFonts w:ascii="Calibri" w:eastAsia="Times New Roman" w:hAnsi="Calibri" w:cs="Calibri"/>
+          <w:color w:val="1A1A1A"/>
+          <w:sz w:val="22"/>
+          <w:szCs w:val="22"/>
+          <w:lang w:val="en"/>
+        </w:rPr>
+        <w:t xml:space="preserve"> format -- covering type conversion, property and event linking, defaults, notes, unit add/remove/swap, regular-expression rules, and reusable named value mappings.</w:t>
       </w:r>
     </w:p>
     <w:p>
@@ -5731,7 +6340,29 @@
           <w:szCs w:val="22"/>
           <w:lang w:val="en"/>
         </w:rPr>
-        <w:t xml:space="preserve"> with conditional branches, so an enum or a set of related properties translates once and is applied wherever needed.</w:t>
+        <w:t xml:space="preserve"> with conditional branches, so an </w:t>
+      </w:r>
+      <w:proofErr w:type="spellStart"/>
+      <w:r>
+        <w:rPr>
+          <w:rFonts w:ascii="Calibri" w:eastAsia="Times New Roman" w:hAnsi="Calibri" w:cs="Calibri"/>
+          <w:color w:val="1A1A1A"/>
+          <w:sz w:val="22"/>
+          <w:szCs w:val="22"/>
+          <w:lang w:val="en"/>
+        </w:rPr>
+        <w:t>enum</w:t>
+      </w:r>
+      <w:proofErr w:type="spellEnd"/>
+      <w:r>
+        <w:rPr>
+          <w:rFonts w:ascii="Calibri" w:eastAsia="Times New Roman" w:hAnsi="Calibri" w:cs="Calibri"/>
+          <w:color w:val="1A1A1A"/>
+          <w:sz w:val="22"/>
+          <w:szCs w:val="22"/>
+          <w:lang w:val="en"/>
+        </w:rPr>
+        <w:t xml:space="preserve"> or a set of related properties translates once and is applied wherever needed.</w:t>
       </w:r>
     </w:p>
     <w:p>
@@ -5770,7 +6401,29 @@
           <w:szCs w:val="22"/>
           <w:lang w:val="en"/>
         </w:rPr>
-        <w:t xml:space="preserve"> -- rules can be labelled so a single rule book serves several migration jobs and a job selects only the rules it needs.</w:t>
+        <w:t xml:space="preserve"> -- rules can be labelled so a single rule book serves several migration </w:t>
+      </w:r>
+      <w:proofErr w:type="gramStart"/>
+      <w:r>
+        <w:rPr>
+          <w:rFonts w:ascii="Calibri" w:eastAsia="Times New Roman" w:hAnsi="Calibri" w:cs="Calibri"/>
+          <w:color w:val="1A1A1A"/>
+          <w:sz w:val="22"/>
+          <w:szCs w:val="22"/>
+          <w:lang w:val="en"/>
+        </w:rPr>
+        <w:t>jobs</w:t>
+      </w:r>
+      <w:proofErr w:type="gramEnd"/>
+      <w:r>
+        <w:rPr>
+          <w:rFonts w:ascii="Calibri" w:eastAsia="Times New Roman" w:hAnsi="Calibri" w:cs="Calibri"/>
+          <w:color w:val="1A1A1A"/>
+          <w:sz w:val="22"/>
+          <w:szCs w:val="22"/>
+          <w:lang w:val="en"/>
+        </w:rPr>
+        <w:t xml:space="preserve"> and a job selects only the rules it needs.</w:t>
       </w:r>
     </w:p>
     <w:p>
@@ -5922,7 +6575,18 @@
           <w:szCs w:val="22"/>
           <w:lang w:val="en"/>
         </w:rPr>
-        <w:t xml:space="preserve"> clauses, the </w:t>
+        <w:t xml:space="preserve"> clauses, </w:t>
+      </w:r>
+      <w:proofErr w:type="gramStart"/>
+      <w:r>
+        <w:rPr>
+          <w:rFonts w:ascii="Calibri" w:eastAsia="Times New Roman" w:hAnsi="Calibri" w:cs="Calibri"/>
+          <w:color w:val="1A1A1A"/>
+          <w:sz w:val="22"/>
+          <w:szCs w:val="22"/>
+          <w:lang w:val="en"/>
+        </w:rPr>
+        <w:t xml:space="preserve">the </w:t>
       </w:r>
       <w:r>
         <w:rPr>
@@ -5930,8 +6594,19 @@
           <w:color w:val="1A1A1A"/>
           <w:lang w:val="en"/>
         </w:rPr>
-        <w:t>.dfm</w:t>
-      </w:r>
+        <w:t>.</w:t>
+      </w:r>
+      <w:proofErr w:type="spellStart"/>
+      <w:r>
+        <w:rPr>
+          <w:rStyle w:val="HTMLCode"/>
+          <w:color w:val="1A1A1A"/>
+          <w:lang w:val="en"/>
+        </w:rPr>
+        <w:t>dfm</w:t>
+      </w:r>
+      <w:proofErr w:type="spellEnd"/>
+      <w:proofErr w:type="gramEnd"/>
       <w:r>
         <w:rPr>
           <w:rFonts w:ascii="Calibri" w:eastAsia="Times New Roman" w:hAnsi="Calibri" w:cs="Calibri"/>
@@ -6096,7 +6771,29 @@
           <w:szCs w:val="22"/>
           <w:lang w:val="en"/>
         </w:rPr>
-        <w:t xml:space="preserve"> -- what could not be converted is emitted as typed JSON items, so the leftover work can be dispatched programmatically instead of read out of prose.</w:t>
+        <w:t xml:space="preserve"> -- what could not be converted is emitted as typed JSON items, so the leftover work can be dispatched programmatically instead of </w:t>
+      </w:r>
+      <w:proofErr w:type="gramStart"/>
+      <w:r>
+        <w:rPr>
+          <w:rFonts w:ascii="Calibri" w:eastAsia="Times New Roman" w:hAnsi="Calibri" w:cs="Calibri"/>
+          <w:color w:val="1A1A1A"/>
+          <w:sz w:val="22"/>
+          <w:szCs w:val="22"/>
+          <w:lang w:val="en"/>
+        </w:rPr>
+        <w:t>read</w:t>
+      </w:r>
+      <w:proofErr w:type="gramEnd"/>
+      <w:r>
+        <w:rPr>
+          <w:rFonts w:ascii="Calibri" w:eastAsia="Times New Roman" w:hAnsi="Calibri" w:cs="Calibri"/>
+          <w:color w:val="1A1A1A"/>
+          <w:sz w:val="22"/>
+          <w:szCs w:val="22"/>
+          <w:lang w:val="en"/>
+        </w:rPr>
+        <w:t xml:space="preserve"> out of prose.</w:t>
       </w:r>
     </w:p>
     <w:p>
@@ -6161,49 +6858,9 @@
           <w:szCs w:val="22"/>
           <w:lang w:val="en"/>
         </w:rPr>
-        <w:t>Known limitation in this release, and it is destructive.</w:t>
-      </w:r>
-      <w:r>
-        <w:rPr>
-          <w:rFonts w:ascii="Calibri" w:hAnsi="Calibri" w:cs="Calibri"/>
-          <w:color w:val="1A1A1A"/>
-          <w:sz w:val="22"/>
-          <w:szCs w:val="22"/>
-          <w:lang w:val="en"/>
-        </w:rPr>
-        <w:t xml:space="preserve"> </w:t>
-      </w:r>
-      <w:r>
-        <w:rPr>
-          <w:rFonts w:ascii="Calibri" w:hAnsi="Calibri" w:cs="Calibri"/>
-          <w:color w:val="1A1A1A"/>
-          <w:sz w:val="22"/>
-          <w:szCs w:val="22"/>
-          <w:lang w:val="en"/>
-        </w:rPr>
-        <w:t xml:space="preserve">When a conversion needs to convert a </w:t>
-      </w:r>
-      <w:r>
-        <w:rPr>
-          <w:rStyle w:val="Emphasis"/>
-          <w:rFonts w:ascii="Calibri" w:hAnsi="Calibri" w:cs="Calibri"/>
-          <w:color w:val="1A1A1A"/>
-          <w:sz w:val="22"/>
-          <w:szCs w:val="22"/>
-          <w:lang w:val="en"/>
-        </w:rPr>
-        <w:t>value</w:t>
-      </w:r>
-      <w:r>
-        <w:rPr>
-          <w:rFonts w:ascii="Calibri" w:hAnsi="Calibri" w:cs="Calibri"/>
-          <w:color w:val="1A1A1A"/>
-          <w:sz w:val="22"/>
-          <w:szCs w:val="22"/>
-          <w:lang w:val="en"/>
-        </w:rPr>
-        <w:t xml:space="preserve"> as well as a property -- an image handed to a different image type, for instance -- the image data is currently </w:t>
-      </w:r>
+        <w:t xml:space="preserve">Known </w:t>
+      </w:r>
+      <w:proofErr w:type="gramStart"/>
       <w:r>
         <w:rPr>
           <w:rFonts w:ascii="Calibri" w:hAnsi="Calibri" w:cs="Calibri"/>
@@ -6214,60 +6871,9 @@
           <w:szCs w:val="22"/>
           <w:lang w:val="en"/>
         </w:rPr>
-        <w:t>dropped</w:t>
-      </w:r>
-      <w:r>
-        <w:rPr>
-          <w:rFonts w:ascii="Calibri" w:hAnsi="Calibri" w:cs="Calibri"/>
-          <w:color w:val="1A1A1A"/>
-          <w:sz w:val="22"/>
-          <w:szCs w:val="22"/>
-          <w:lang w:val="en"/>
-        </w:rPr>
-        <w:t xml:space="preserve"> while the run reports success. Twenty buttons come out of a conversion that printed </w:t>
-      </w:r>
-      <w:r>
-        <w:rPr>
-          <w:rStyle w:val="HTMLCode"/>
-          <w:color w:val="1A1A1A"/>
-          <w:lang w:val="en"/>
-        </w:rPr>
-        <w:t>20 instance(s) converted</w:t>
-      </w:r>
-      <w:r>
-        <w:rPr>
-          <w:rFonts w:ascii="Calibri" w:hAnsi="Calibri" w:cs="Calibri"/>
-          <w:color w:val="1A1A1A"/>
-          <w:sz w:val="22"/>
-          <w:szCs w:val="22"/>
-          <w:lang w:val="en"/>
-        </w:rPr>
-        <w:t xml:space="preserve"> with no glyphs.</w:t>
-      </w:r>
-    </w:p>
-    <w:p>
-      <w:pPr>
-        <w:pStyle w:val="NormalWeb"/>
-        <w:shd w:val="clear" w:color="auto" w:fill="FBF7EC"/>
-        <w:divId w:val="1228034265"/>
-        <w:rPr>
-          <w:rFonts w:ascii="Calibri" w:hAnsi="Calibri" w:cs="Calibri"/>
-          <w:color w:val="1A1A1A"/>
-          <w:sz w:val="22"/>
-          <w:szCs w:val="22"/>
-          <w:lang w:val="en"/>
-        </w:rPr>
-      </w:pPr>
-      <w:r>
-        <w:rPr>
-          <w:rFonts w:ascii="Calibri" w:hAnsi="Calibri" w:cs="Calibri"/>
-          <w:color w:val="1A1A1A"/>
-          <w:sz w:val="22"/>
-          <w:szCs w:val="22"/>
-          <w:lang w:val="en"/>
-        </w:rPr>
-        <w:t xml:space="preserve">Fixing it is the </w:t>
-      </w:r>
+        <w:t>limitation</w:t>
+      </w:r>
+      <w:proofErr w:type="gramEnd"/>
       <w:r>
         <w:rPr>
           <w:rFonts w:ascii="Calibri" w:hAnsi="Calibri" w:cs="Calibri"/>
@@ -6278,6 +6884,125 @@
           <w:szCs w:val="22"/>
           <w:lang w:val="en"/>
         </w:rPr>
+        <w:t xml:space="preserve"> in this release, and it is destructive.</w:t>
+      </w:r>
+      <w:r>
+        <w:rPr>
+          <w:rFonts w:ascii="Calibri" w:hAnsi="Calibri" w:cs="Calibri"/>
+          <w:color w:val="1A1A1A"/>
+          <w:sz w:val="22"/>
+          <w:szCs w:val="22"/>
+          <w:lang w:val="en"/>
+        </w:rPr>
+        <w:t xml:space="preserve"> When a conversion needs to convert a </w:t>
+      </w:r>
+      <w:r>
+        <w:rPr>
+          <w:rStyle w:val="Emphasis"/>
+          <w:rFonts w:ascii="Calibri" w:hAnsi="Calibri" w:cs="Calibri"/>
+          <w:color w:val="1A1A1A"/>
+          <w:sz w:val="22"/>
+          <w:szCs w:val="22"/>
+          <w:lang w:val="en"/>
+        </w:rPr>
+        <w:t>value</w:t>
+      </w:r>
+      <w:r>
+        <w:rPr>
+          <w:rFonts w:ascii="Calibri" w:hAnsi="Calibri" w:cs="Calibri"/>
+          <w:color w:val="1A1A1A"/>
+          <w:sz w:val="22"/>
+          <w:szCs w:val="22"/>
+          <w:lang w:val="en"/>
+        </w:rPr>
+        <w:t xml:space="preserve"> as well as a property -- an image handed to a different image type, for instance -- the image data is currently </w:t>
+      </w:r>
+      <w:r>
+        <w:rPr>
+          <w:rFonts w:ascii="Calibri" w:hAnsi="Calibri" w:cs="Calibri"/>
+          <w:b/>
+          <w:bCs/>
+          <w:color w:val="000000"/>
+          <w:sz w:val="22"/>
+          <w:szCs w:val="22"/>
+          <w:lang w:val="en"/>
+        </w:rPr>
+        <w:t>dropped</w:t>
+      </w:r>
+      <w:r>
+        <w:rPr>
+          <w:rFonts w:ascii="Calibri" w:hAnsi="Calibri" w:cs="Calibri"/>
+          <w:color w:val="1A1A1A"/>
+          <w:sz w:val="22"/>
+          <w:szCs w:val="22"/>
+          <w:lang w:val="en"/>
+        </w:rPr>
+        <w:t xml:space="preserve"> while the run reports success. Twenty buttons come out of a conversion that printed </w:t>
+      </w:r>
+      <w:r>
+        <w:rPr>
+          <w:rStyle w:val="HTMLCode"/>
+          <w:color w:val="1A1A1A"/>
+          <w:lang w:val="en"/>
+        </w:rPr>
+        <w:t>20 instance(s) converted</w:t>
+      </w:r>
+      <w:r>
+        <w:rPr>
+          <w:rFonts w:ascii="Calibri" w:hAnsi="Calibri" w:cs="Calibri"/>
+          <w:color w:val="1A1A1A"/>
+          <w:sz w:val="22"/>
+          <w:szCs w:val="22"/>
+          <w:lang w:val="en"/>
+        </w:rPr>
+        <w:t xml:space="preserve"> with no glyphs.</w:t>
+      </w:r>
+    </w:p>
+    <w:p>
+      <w:pPr>
+        <w:pStyle w:val="NormalWeb"/>
+        <w:shd w:val="clear" w:color="auto" w:fill="FBF7EC"/>
+        <w:divId w:val="1228034265"/>
+        <w:rPr>
+          <w:rFonts w:ascii="Calibri" w:hAnsi="Calibri" w:cs="Calibri"/>
+          <w:color w:val="1A1A1A"/>
+          <w:sz w:val="22"/>
+          <w:szCs w:val="22"/>
+          <w:lang w:val="en"/>
+        </w:rPr>
+      </w:pPr>
+      <w:proofErr w:type="gramStart"/>
+      <w:r>
+        <w:rPr>
+          <w:rFonts w:ascii="Calibri" w:hAnsi="Calibri" w:cs="Calibri"/>
+          <w:color w:val="1A1A1A"/>
+          <w:sz w:val="22"/>
+          <w:szCs w:val="22"/>
+          <w:lang w:val="en"/>
+        </w:rPr>
+        <w:t>Fixing it</w:t>
+      </w:r>
+      <w:proofErr w:type="gramEnd"/>
+      <w:r>
+        <w:rPr>
+          <w:rFonts w:ascii="Calibri" w:hAnsi="Calibri" w:cs="Calibri"/>
+          <w:color w:val="1A1A1A"/>
+          <w:sz w:val="22"/>
+          <w:szCs w:val="22"/>
+          <w:lang w:val="en"/>
+        </w:rPr>
+        <w:t xml:space="preserve"> is the </w:t>
+      </w:r>
+      <w:r>
+        <w:rPr>
+          <w:rFonts w:ascii="Calibri" w:hAnsi="Calibri" w:cs="Calibri"/>
+          <w:b/>
+          <w:bCs/>
+          <w:color w:val="000000"/>
+          <w:sz w:val="22"/>
+          <w:szCs w:val="22"/>
+          <w:lang w:val="en"/>
+        </w:rPr>
         <w:t>first</w:t>
       </w:r>
       <w:r>
@@ -6288,17 +7013,7 @@
           <w:szCs w:val="22"/>
           <w:lang w:val="en"/>
         </w:rPr>
-        <w:t xml:space="preserve"> piece of work after this release (chapter 13). Until then, treat image-carrying conversions as manual. A conversion whose unit </w:t>
-      </w:r>
-      <w:r>
-        <w:rPr>
-          <w:rFonts w:ascii="Calibri" w:hAnsi="Calibri" w:cs="Calibri"/>
-          <w:color w:val="1A1A1A"/>
-          <w:sz w:val="22"/>
-          <w:szCs w:val="22"/>
-          <w:lang w:val="en"/>
-        </w:rPr>
-        <w:t>is not in any supplied index is now refused with a message that says so, rather than one that blamed the form file.</w:t>
+        <w:t xml:space="preserve"> piece of work after this release (chapter 13). Until then, treat image-carrying conversions as manual. A conversion whose unit is not in any supplied index is now refused with a message that says so, rather than one that blamed the form file.</w:t>
       </w:r>
     </w:p>
     <w:p>
@@ -6432,17 +7147,7 @@
           <w:szCs w:val="22"/>
           <w:lang w:val="en"/>
         </w:rPr>
-        <w:t xml:space="preserve"> </w:t>
-      </w:r>
-      <w:r>
-        <w:rPr>
-          <w:rFonts w:ascii="Calibri" w:eastAsia="Times New Roman" w:hAnsi="Calibri" w:cs="Calibri"/>
-          <w:color w:val="1A1A1A"/>
-          <w:sz w:val="22"/>
-          <w:szCs w:val="22"/>
-          <w:lang w:val="en"/>
-        </w:rPr>
-        <w:t>-- a percent-complete column per conversion rule, so a large migration has a visible finish line.</w:t>
+        <w:t xml:space="preserve"> -- a percent-complete column per conversion rule, so a large migration has a visible finish line.</w:t>
       </w:r>
     </w:p>
     <w:p>
@@ -6481,7 +7186,29 @@
           <w:szCs w:val="22"/>
           <w:lang w:val="en"/>
         </w:rPr>
-        <w:t xml:space="preserve"> behind the grid, read from the index, so you only ever map to properties that genuinely exist.</w:t>
+        <w:t xml:space="preserve"> behind the grid, read from the index, so you only ever map to </w:t>
+      </w:r>
+      <w:proofErr w:type="gramStart"/>
+      <w:r>
+        <w:rPr>
+          <w:rFonts w:ascii="Calibri" w:eastAsia="Times New Roman" w:hAnsi="Calibri" w:cs="Calibri"/>
+          <w:color w:val="1A1A1A"/>
+          <w:sz w:val="22"/>
+          <w:szCs w:val="22"/>
+          <w:lang w:val="en"/>
+        </w:rPr>
+        <w:t>properties</w:t>
+      </w:r>
+      <w:proofErr w:type="gramEnd"/>
+      <w:r>
+        <w:rPr>
+          <w:rFonts w:ascii="Calibri" w:eastAsia="Times New Roman" w:hAnsi="Calibri" w:cs="Calibri"/>
+          <w:color w:val="1A1A1A"/>
+          <w:sz w:val="22"/>
+          <w:szCs w:val="22"/>
+          <w:lang w:val="en"/>
+        </w:rPr>
+        <w:t xml:space="preserve"> that genuinely exist.</w:t>
       </w:r>
     </w:p>
     <w:p>
@@ -6559,7 +7286,18 @@
           <w:szCs w:val="22"/>
           <w:lang w:val="en"/>
         </w:rPr>
-        <w:t xml:space="preserve"> -- open a real </w:t>
+        <w:t xml:space="preserve"> -- open a </w:t>
+      </w:r>
+      <w:proofErr w:type="gramStart"/>
+      <w:r>
+        <w:rPr>
+          <w:rFonts w:ascii="Calibri" w:eastAsia="Times New Roman" w:hAnsi="Calibri" w:cs="Calibri"/>
+          <w:color w:val="1A1A1A"/>
+          <w:sz w:val="22"/>
+          <w:szCs w:val="22"/>
+          <w:lang w:val="en"/>
+        </w:rPr>
+        <w:t xml:space="preserve">real </w:t>
       </w:r>
       <w:r>
         <w:rPr>
@@ -6567,8 +7305,19 @@
           <w:color w:val="1A1A1A"/>
           <w:lang w:val="en"/>
         </w:rPr>
-        <w:t>.dfm</w:t>
-      </w:r>
+        <w:t>.</w:t>
+      </w:r>
+      <w:proofErr w:type="spellStart"/>
+      <w:r>
+        <w:rPr>
+          <w:rStyle w:val="HTMLCode"/>
+          <w:color w:val="1A1A1A"/>
+          <w:lang w:val="en"/>
+        </w:rPr>
+        <w:t>dfm</w:t>
+      </w:r>
+      <w:proofErr w:type="spellEnd"/>
+      <w:proofErr w:type="gramEnd"/>
       <w:r>
         <w:rPr>
           <w:rFonts w:ascii="Calibri" w:eastAsia="Times New Roman" w:hAnsi="Calibri" w:cs="Calibri"/>
@@ -6694,17 +7443,7 @@
           <w:szCs w:val="22"/>
           <w:lang w:val="en"/>
         </w:rPr>
-        <w:t xml:space="preserve"> </w:t>
-      </w:r>
-      <w:r>
-        <w:rPr>
-          <w:rFonts w:ascii="Calibri" w:eastAsia="Times New Roman" w:hAnsi="Calibri" w:cs="Calibri"/>
-          <w:color w:val="1A1A1A"/>
-          <w:sz w:val="22"/>
-          <w:szCs w:val="22"/>
-          <w:lang w:val="en"/>
-        </w:rPr>
-        <w:t>across a whole corpus of rule books.</w:t>
+        <w:t xml:space="preserve"> across a whole corpus of rule books.</w:t>
       </w:r>
     </w:p>
     <w:p>
@@ -6782,7 +7521,29 @@
           <w:szCs w:val="22"/>
           <w:lang w:val="en"/>
         </w:rPr>
-        <w:t xml:space="preserve"> -- writes a backup, re-emits canonical DSL, and runs the engine's validator before accepting the file.</w:t>
+        <w:t xml:space="preserve"> -- writes </w:t>
+      </w:r>
+      <w:proofErr w:type="gramStart"/>
+      <w:r>
+        <w:rPr>
+          <w:rFonts w:ascii="Calibri" w:eastAsia="Times New Roman" w:hAnsi="Calibri" w:cs="Calibri"/>
+          <w:color w:val="1A1A1A"/>
+          <w:sz w:val="22"/>
+          <w:szCs w:val="22"/>
+          <w:lang w:val="en"/>
+        </w:rPr>
+        <w:t>a backup</w:t>
+      </w:r>
+      <w:proofErr w:type="gramEnd"/>
+      <w:r>
+        <w:rPr>
+          <w:rFonts w:ascii="Calibri" w:eastAsia="Times New Roman" w:hAnsi="Calibri" w:cs="Calibri"/>
+          <w:color w:val="1A1A1A"/>
+          <w:sz w:val="22"/>
+          <w:szCs w:val="22"/>
+          <w:lang w:val="en"/>
+        </w:rPr>
+        <w:t>, re-emits canonical DSL, and runs the engine's validator before accepting the file.</w:t>
       </w:r>
     </w:p>
     <w:p>
@@ -6877,7 +7638,18 @@
           <w:szCs w:val="22"/>
           <w:lang w:val="en"/>
         </w:rPr>
-        <w:t xml:space="preserve"> -- the From Unit box accepts a loose </w:t>
+        <w:t xml:space="preserve"> -- the From Unit box accepts a </w:t>
+      </w:r>
+      <w:proofErr w:type="gramStart"/>
+      <w:r>
+        <w:rPr>
+          <w:rFonts w:ascii="Calibri" w:eastAsia="Times New Roman" w:hAnsi="Calibri" w:cs="Calibri"/>
+          <w:color w:val="1A1A1A"/>
+          <w:sz w:val="22"/>
+          <w:szCs w:val="22"/>
+          <w:lang w:val="en"/>
+        </w:rPr>
+        <w:t xml:space="preserve">loose </w:t>
       </w:r>
       <w:r>
         <w:rPr>
@@ -6887,15 +7659,27 @@
         </w:rPr>
         <w:t>.pas</w:t>
       </w:r>
-      <w:r>
-        <w:rPr>
-          <w:rFonts w:ascii="Calibri" w:eastAsia="Times New Roman" w:hAnsi="Calibri" w:cs="Calibri"/>
-          <w:color w:val="1A1A1A"/>
-          <w:sz w:val="22"/>
-          <w:szCs w:val="22"/>
-          <w:lang w:val="en"/>
-        </w:rPr>
-        <w:t xml:space="preserve"> or </w:t>
+      <w:proofErr w:type="gramEnd"/>
+      <w:r>
+        <w:rPr>
+          <w:rFonts w:ascii="Calibri" w:eastAsia="Times New Roman" w:hAnsi="Calibri" w:cs="Calibri"/>
+          <w:color w:val="1A1A1A"/>
+          <w:sz w:val="22"/>
+          <w:szCs w:val="22"/>
+          <w:lang w:val="en"/>
+        </w:rPr>
+        <w:t xml:space="preserve"> </w:t>
+      </w:r>
+      <w:proofErr w:type="gramStart"/>
+      <w:r>
+        <w:rPr>
+          <w:rFonts w:ascii="Calibri" w:eastAsia="Times New Roman" w:hAnsi="Calibri" w:cs="Calibri"/>
+          <w:color w:val="1A1A1A"/>
+          <w:sz w:val="22"/>
+          <w:szCs w:val="22"/>
+          <w:lang w:val="en"/>
+        </w:rPr>
+        <w:t xml:space="preserve">or </w:t>
       </w:r>
       <w:r>
         <w:rPr>
@@ -6903,27 +7687,28 @@
           <w:color w:val="1A1A1A"/>
           <w:lang w:val="en"/>
         </w:rPr>
-        <w:t>.dfm</w:t>
-      </w:r>
-      <w:r>
-        <w:rPr>
-          <w:rFonts w:ascii="Calibri" w:eastAsia="Times New Roman" w:hAnsi="Calibri" w:cs="Calibri"/>
-          <w:color w:val="1A1A1A"/>
-          <w:sz w:val="22"/>
-          <w:szCs w:val="22"/>
-          <w:lang w:val="en"/>
-        </w:rPr>
-        <w:t xml:space="preserve"> </w:t>
-      </w:r>
-      <w:r>
-        <w:rPr>
-          <w:rFonts w:ascii="Calibri" w:eastAsia="Times New Roman" w:hAnsi="Calibri" w:cs="Calibri"/>
-          <w:color w:val="1A1A1A"/>
-          <w:sz w:val="22"/>
-          <w:szCs w:val="22"/>
-          <w:lang w:val="en"/>
-        </w:rPr>
-        <w:t>browsed from disk, so a form that no project file lists can still be converted. This is the common case in a long-lived codebase, and it previously stopped the job.</w:t>
+        <w:t>.</w:t>
+      </w:r>
+      <w:proofErr w:type="spellStart"/>
+      <w:r>
+        <w:rPr>
+          <w:rStyle w:val="HTMLCode"/>
+          <w:color w:val="1A1A1A"/>
+          <w:lang w:val="en"/>
+        </w:rPr>
+        <w:t>dfm</w:t>
+      </w:r>
+      <w:proofErr w:type="spellEnd"/>
+      <w:proofErr w:type="gramEnd"/>
+      <w:r>
+        <w:rPr>
+          <w:rFonts w:ascii="Calibri" w:eastAsia="Times New Roman" w:hAnsi="Calibri" w:cs="Calibri"/>
+          <w:color w:val="1A1A1A"/>
+          <w:sz w:val="22"/>
+          <w:szCs w:val="22"/>
+          <w:lang w:val="en"/>
+        </w:rPr>
+        <w:t xml:space="preserve"> browsed from disk, so a form that no project file lists can still be converted. This is the common case in a long-lived codebase, and it previously stopped the job.</w:t>
       </w:r>
     </w:p>
     <w:p>
@@ -6962,7 +7747,29 @@
           <w:szCs w:val="22"/>
           <w:lang w:val="en"/>
         </w:rPr>
-        <w:t xml:space="preserve"> -- a "Can convert to:" list beneath the target pool, so the author sees which target types a source component actually has rules for instead of discovering it by trying.</w:t>
+        <w:t xml:space="preserve"> -- a "Can convert to:" list beneath the target pool, so the author sees which target types a source component </w:t>
+      </w:r>
+      <w:proofErr w:type="gramStart"/>
+      <w:r>
+        <w:rPr>
+          <w:rFonts w:ascii="Calibri" w:eastAsia="Times New Roman" w:hAnsi="Calibri" w:cs="Calibri"/>
+          <w:color w:val="1A1A1A"/>
+          <w:sz w:val="22"/>
+          <w:szCs w:val="22"/>
+          <w:lang w:val="en"/>
+        </w:rPr>
+        <w:t>actually has</w:t>
+      </w:r>
+      <w:proofErr w:type="gramEnd"/>
+      <w:r>
+        <w:rPr>
+          <w:rFonts w:ascii="Calibri" w:eastAsia="Times New Roman" w:hAnsi="Calibri" w:cs="Calibri"/>
+          <w:color w:val="1A1A1A"/>
+          <w:sz w:val="22"/>
+          <w:szCs w:val="22"/>
+          <w:lang w:val="en"/>
+        </w:rPr>
+        <w:t xml:space="preserve"> rules for instead of discovering it by trying.</w:t>
       </w:r>
     </w:p>
     <w:p>
@@ -7040,17 +7847,7 @@
           <w:szCs w:val="22"/>
           <w:lang w:val="en"/>
         </w:rPr>
-        <w:t xml:space="preserve"> </w:t>
-      </w:r>
-      <w:r>
-        <w:rPr>
-          <w:rFonts w:ascii="Calibri" w:eastAsia="Times New Roman" w:hAnsi="Calibri" w:cs="Calibri"/>
-          <w:color w:val="1A1A1A"/>
-          <w:sz w:val="22"/>
-          <w:szCs w:val="22"/>
-          <w:lang w:val="en"/>
-        </w:rPr>
-        <w:t xml:space="preserve">-- the editor is tested against a pinned copy of the engine, and a check compares it by </w:t>
+        <w:t xml:space="preserve"> -- the editor is tested against a pinned copy of the engine, and a check compares it by </w:t>
       </w:r>
       <w:r>
         <w:rPr>
@@ -7072,7 +7869,29 @@
           <w:szCs w:val="22"/>
           <w:lang w:val="en"/>
         </w:rPr>
-        <w:t xml:space="preserve"> rather than version string. Two builds of the same version can differ, and a GUI test rebuilt underneath you produces failures that belong to neither side.</w:t>
+        <w:t xml:space="preserve"> rather than version string. Two builds of the same version can differ, and a GUI test rebuilt underneath you produces failures that belong to </w:t>
+      </w:r>
+      <w:proofErr w:type="gramStart"/>
+      <w:r>
+        <w:rPr>
+          <w:rFonts w:ascii="Calibri" w:eastAsia="Times New Roman" w:hAnsi="Calibri" w:cs="Calibri"/>
+          <w:color w:val="1A1A1A"/>
+          <w:sz w:val="22"/>
+          <w:szCs w:val="22"/>
+          <w:lang w:val="en"/>
+        </w:rPr>
+        <w:t>neither</w:t>
+      </w:r>
+      <w:proofErr w:type="gramEnd"/>
+      <w:r>
+        <w:rPr>
+          <w:rFonts w:ascii="Calibri" w:eastAsia="Times New Roman" w:hAnsi="Calibri" w:cs="Calibri"/>
+          <w:color w:val="1A1A1A"/>
+          <w:sz w:val="22"/>
+          <w:szCs w:val="22"/>
+          <w:lang w:val="en"/>
+        </w:rPr>
+        <w:t xml:space="preserve"> side.</w:t>
       </w:r>
     </w:p>
     <w:p>
@@ -7129,7 +7948,18 @@
           <w:szCs w:val="22"/>
           <w:lang w:val="en"/>
         </w:rPr>
-        <w:t xml:space="preserve"> for the code: the code-side scan matches any </w:t>
+        <w:t xml:space="preserve"> for the code: the code-side scan matches </w:t>
+      </w:r>
+      <w:proofErr w:type="gramStart"/>
+      <w:r>
+        <w:rPr>
+          <w:rFonts w:ascii="Calibri" w:hAnsi="Calibri" w:cs="Calibri"/>
+          <w:color w:val="1A1A1A"/>
+          <w:sz w:val="22"/>
+          <w:szCs w:val="22"/>
+          <w:lang w:val="en"/>
+        </w:rPr>
+        <w:t xml:space="preserve">any </w:t>
       </w:r>
       <w:r>
         <w:rPr>
@@ -7139,6 +7969,7 @@
         </w:rPr>
         <w:t>.Property</w:t>
       </w:r>
+      <w:proofErr w:type="gramEnd"/>
       <w:r>
         <w:rPr>
           <w:rFonts w:ascii="Calibri" w:hAnsi="Calibri" w:cs="Calibri"/>
@@ -7147,17 +7978,7 @@
           <w:szCs w:val="22"/>
           <w:lang w:val="en"/>
         </w:rPr>
-        <w:t xml:space="preserve"> text without </w:t>
-      </w:r>
-      <w:r>
-        <w:rPr>
-          <w:rFonts w:ascii="Calibri" w:hAnsi="Calibri" w:cs="Calibri"/>
-          <w:color w:val="1A1A1A"/>
-          <w:sz w:val="22"/>
-          <w:szCs w:val="22"/>
-          <w:lang w:val="en"/>
-        </w:rPr>
-        <w:t>knowing the receiver's type or skipping comments, so a property can be marked used on the strength of a different component's call, or of a commented-out line. The fix is designed -- match against the known instance names of the source class, which the form file already supplies -- and is listed in the roadmap.</w:t>
+        <w:t xml:space="preserve"> text without knowing the receiver's type or skipping comments, so a property can be marked used on the strength of a different component's call, or of a commented-out line. The fix is designed -- match against the known instance names of the source class, which the form file already supplies -- and is listed in the roadmap.</w:t>
       </w:r>
     </w:p>
     <w:p>
@@ -7237,6 +8058,7 @@
         </w:rPr>
         <w:t xml:space="preserve">Point at </w:t>
       </w:r>
+      <w:proofErr w:type="spellStart"/>
       <w:r>
         <w:rPr>
           <w:rStyle w:val="HTMLCode"/>
@@ -7245,6 +8067,7 @@
         </w:rPr>
         <w:t>ImcSTATIONS</w:t>
       </w:r>
+      <w:proofErr w:type="spellEnd"/>
       <w:r>
         <w:rPr>
           <w:rFonts w:ascii="Calibri" w:hAnsi="Calibri" w:cs="Calibri"/>
@@ -7253,18 +8076,9 @@
           <w:szCs w:val="22"/>
           <w:lang w:val="en"/>
         </w:rPr>
-        <w:t xml:space="preserve"> </w:t>
-      </w:r>
-      <w:r>
-        <w:rPr>
-          <w:rFonts w:ascii="Calibri" w:hAnsi="Calibri" w:cs="Calibri"/>
-          <w:color w:val="1A1A1A"/>
-          <w:sz w:val="22"/>
-          <w:szCs w:val="22"/>
-          <w:lang w:val="en"/>
-        </w:rPr>
-        <w:t xml:space="preserve">and the answer is </w:t>
-      </w:r>
+        <w:t xml:space="preserve"> and the answer is </w:t>
+      </w:r>
+      <w:proofErr w:type="spellStart"/>
       <w:r>
         <w:rPr>
           <w:rStyle w:val="HTMLCode"/>
@@ -7273,6 +8087,7 @@
         </w:rPr>
         <w:t>TmcSTATIONS</w:t>
       </w:r>
+      <w:proofErr w:type="spellEnd"/>
       <w:r>
         <w:rPr>
           <w:rFonts w:ascii="Calibri" w:hAnsi="Calibri" w:cs="Calibri"/>
@@ -7302,7 +8117,29 @@
           <w:szCs w:val="22"/>
           <w:lang w:val="en"/>
         </w:rPr>
-        <w:t>, because one is something you can create and the other is not. The same fact is written into the generated documentation, so it can be read without any tool.</w:t>
+        <w:t xml:space="preserve">, because one is something you can create and the other is not. The same fact is written into the </w:t>
+      </w:r>
+      <w:proofErr w:type="gramStart"/>
+      <w:r>
+        <w:rPr>
+          <w:rFonts w:ascii="Calibri" w:hAnsi="Calibri" w:cs="Calibri"/>
+          <w:color w:val="1A1A1A"/>
+          <w:sz w:val="22"/>
+          <w:szCs w:val="22"/>
+          <w:lang w:val="en"/>
+        </w:rPr>
+        <w:t>generated documentation</w:t>
+      </w:r>
+      <w:proofErr w:type="gramEnd"/>
+      <w:r>
+        <w:rPr>
+          <w:rFonts w:ascii="Calibri" w:hAnsi="Calibri" w:cs="Calibri"/>
+          <w:color w:val="1A1A1A"/>
+          <w:sz w:val="22"/>
+          <w:szCs w:val="22"/>
+          <w:lang w:val="en"/>
+        </w:rPr>
+        <w:t>, so it can be read without any tool.</w:t>
       </w:r>
     </w:p>
     <w:p>
@@ -7342,8 +8179,9 @@
           <w:szCs w:val="22"/>
           <w:lang w:val="en"/>
         </w:rPr>
-        <w:t xml:space="preserve">The format command rewrites source in place, and was the only command with no test coverage at all. It now refuses a formatter version known to be too old </w:t>
-      </w:r>
+        <w:t xml:space="preserve">The format command rewrites source in </w:t>
+      </w:r>
+      <w:proofErr w:type="gramStart"/>
       <w:r>
         <w:rPr>
           <w:rFonts w:ascii="Calibri" w:hAnsi="Calibri" w:cs="Calibri"/>
@@ -7352,7 +8190,18 @@
           <w:szCs w:val="22"/>
           <w:lang w:val="en"/>
         </w:rPr>
-        <w:t xml:space="preserve">(naming the version found, the version required and the path); re-reads the file afterwards and checks that the formatter changed only the </w:t>
+        <w:t>place, and</w:t>
+      </w:r>
+      <w:proofErr w:type="gramEnd"/>
+      <w:r>
+        <w:rPr>
+          <w:rFonts w:ascii="Calibri" w:hAnsi="Calibri" w:cs="Calibri"/>
+          <w:color w:val="1A1A1A"/>
+          <w:sz w:val="22"/>
+          <w:szCs w:val="22"/>
+          <w:lang w:val="en"/>
+        </w:rPr>
+        <w:t xml:space="preserve"> was the only command with no test coverage at all. It now refuses a formatter version known to be too old (naming the version found, the version required and the path); re-reads the file afterwards and checks that the formatter changed only the </w:t>
       </w:r>
       <w:r>
         <w:rPr>
@@ -7622,7 +8471,29 @@
           <w:szCs w:val="22"/>
           <w:lang w:val="en"/>
         </w:rPr>
-        <w:t xml:space="preserve"> shows which target types a source component actually has rules for.</w:t>
+        <w:t xml:space="preserve"> shows which target types a source component </w:t>
+      </w:r>
+      <w:proofErr w:type="gramStart"/>
+      <w:r>
+        <w:rPr>
+          <w:rFonts w:ascii="Calibri" w:eastAsia="Times New Roman" w:hAnsi="Calibri" w:cs="Calibri"/>
+          <w:color w:val="1A1A1A"/>
+          <w:sz w:val="22"/>
+          <w:szCs w:val="22"/>
+          <w:lang w:val="en"/>
+        </w:rPr>
+        <w:t>actually has</w:t>
+      </w:r>
+      <w:proofErr w:type="gramEnd"/>
+      <w:r>
+        <w:rPr>
+          <w:rFonts w:ascii="Calibri" w:eastAsia="Times New Roman" w:hAnsi="Calibri" w:cs="Calibri"/>
+          <w:color w:val="1A1A1A"/>
+          <w:sz w:val="22"/>
+          <w:szCs w:val="22"/>
+          <w:lang w:val="en"/>
+        </w:rPr>
+        <w:t xml:space="preserve"> rules for.</w:t>
       </w:r>
     </w:p>
     <w:p>
@@ -7833,17 +8704,7 @@
           <w:szCs w:val="22"/>
           <w:lang w:val="en"/>
         </w:rPr>
-        <w:t xml:space="preserve"> Items are listed in the order </w:t>
-      </w:r>
-      <w:r>
-        <w:rPr>
-          <w:rFonts w:ascii="Calibri" w:hAnsi="Calibri" w:cs="Calibri"/>
-          <w:color w:val="1A1A1A"/>
-          <w:sz w:val="22"/>
-          <w:szCs w:val="22"/>
-          <w:lang w:val="en"/>
-        </w:rPr>
-        <w:t>currently intended, with rough effort. Order and scope change as priorities do.</w:t>
+        <w:t xml:space="preserve"> Items are listed in the order currently intended, with rough effort. Order and scope change as priorities do.</w:t>
       </w:r>
     </w:p>
     <w:tbl>
@@ -7858,9 +8719,9 @@
         <w:tblLook w:val="04A0" w:firstRow="1" w:lastRow="0" w:firstColumn="1" w:lastColumn="0" w:noHBand="0" w:noVBand="1"/>
       </w:tblPr>
       <w:tblGrid>
-        <w:gridCol w:w="1533"/>
-        <w:gridCol w:w="6300"/>
-        <w:gridCol w:w="1511"/>
+        <w:gridCol w:w="1642"/>
+        <w:gridCol w:w="8140"/>
+        <w:gridCol w:w="1578"/>
       </w:tblGrid>
       <w:tr>
         <w:trPr>
@@ -8074,7 +8935,27 @@
                 <w:sz w:val="21"/>
                 <w:szCs w:val="21"/>
               </w:rPr>
-              <w:t xml:space="preserve">Finish the converter so a conversion that must transform a </w:t>
+              <w:t xml:space="preserve">Finish the converter so a conversion that must </w:t>
+            </w:r>
+            <w:proofErr w:type="gramStart"/>
+            <w:r>
+              <w:rPr>
+                <w:rFonts w:ascii="Calibri" w:eastAsia="Times New Roman" w:hAnsi="Calibri" w:cs="Calibri"/>
+                <w:color w:val="1A1A1A"/>
+                <w:sz w:val="21"/>
+                <w:szCs w:val="21"/>
+              </w:rPr>
+              <w:t>transform</w:t>
+            </w:r>
+            <w:proofErr w:type="gramEnd"/>
+            <w:r>
+              <w:rPr>
+                <w:rFonts w:ascii="Calibri" w:eastAsia="Times New Roman" w:hAnsi="Calibri" w:cs="Calibri"/>
+                <w:color w:val="1A1A1A"/>
+                <w:sz w:val="21"/>
+                <w:szCs w:val="21"/>
+              </w:rPr>
+              <w:t xml:space="preserve"> a </w:t>
             </w:r>
             <w:r>
               <w:rPr>
@@ -8093,7 +8974,47 @@
                 <w:sz w:val="21"/>
                 <w:szCs w:val="21"/>
               </w:rPr>
-              <w:t xml:space="preserve"> -- an image handed to a different image type -- carries it across instead of dropping it, and honours every accepted source type rather than the one the current rule book happens to exercise. Blocks live conversion work today.</w:t>
+              <w:t xml:space="preserve"> -- an image handed to a different image type -- carries it across instead of dropping </w:t>
+            </w:r>
+            <w:proofErr w:type="gramStart"/>
+            <w:r>
+              <w:rPr>
+                <w:rFonts w:ascii="Calibri" w:eastAsia="Times New Roman" w:hAnsi="Calibri" w:cs="Calibri"/>
+                <w:color w:val="1A1A1A"/>
+                <w:sz w:val="21"/>
+                <w:szCs w:val="21"/>
+              </w:rPr>
+              <w:t>it, and</w:t>
+            </w:r>
+            <w:proofErr w:type="gramEnd"/>
+            <w:r>
+              <w:rPr>
+                <w:rFonts w:ascii="Calibri" w:eastAsia="Times New Roman" w:hAnsi="Calibri" w:cs="Calibri"/>
+                <w:color w:val="1A1A1A"/>
+                <w:sz w:val="21"/>
+                <w:szCs w:val="21"/>
+              </w:rPr>
+              <w:t xml:space="preserve"> </w:t>
+            </w:r>
+            <w:proofErr w:type="spellStart"/>
+            <w:r>
+              <w:rPr>
+                <w:rFonts w:ascii="Calibri" w:eastAsia="Times New Roman" w:hAnsi="Calibri" w:cs="Calibri"/>
+                <w:color w:val="1A1A1A"/>
+                <w:sz w:val="21"/>
+                <w:szCs w:val="21"/>
+              </w:rPr>
+              <w:t>honours</w:t>
+            </w:r>
+            <w:proofErr w:type="spellEnd"/>
+            <w:r>
+              <w:rPr>
+                <w:rFonts w:ascii="Calibri" w:eastAsia="Times New Roman" w:hAnsi="Calibri" w:cs="Calibri"/>
+                <w:color w:val="1A1A1A"/>
+                <w:sz w:val="21"/>
+                <w:szCs w:val="21"/>
+              </w:rPr>
+              <w:t xml:space="preserve"> every accepted source type rather than the one the current rule book happens to exercise. Blocks live conversion work today.</w:t>
             </w:r>
           </w:p>
         </w:tc>
@@ -8212,7 +9133,27 @@
                 <w:sz w:val="21"/>
                 <w:szCs w:val="21"/>
               </w:rPr>
-              <w:t>Object analysis stops at a class's own fields and misses everything inherited from a shared base, which understates what a method touches. Decided; needs one piece of groundwork first (recognising a generic base class), which by itself improves ancestry, descendants and type resolution across the estate.</w:t>
+              <w:t>Object analysis stops at a class's own fields and misses everything inherited from a shared base, which understates what a method touches. Decided; needs one piece of groundwork first (</w:t>
+            </w:r>
+            <w:proofErr w:type="spellStart"/>
+            <w:r>
+              <w:rPr>
+                <w:rFonts w:ascii="Calibri" w:eastAsia="Times New Roman" w:hAnsi="Calibri" w:cs="Calibri"/>
+                <w:color w:val="1A1A1A"/>
+                <w:sz w:val="21"/>
+                <w:szCs w:val="21"/>
+              </w:rPr>
+              <w:t>recognising</w:t>
+            </w:r>
+            <w:proofErr w:type="spellEnd"/>
+            <w:r>
+              <w:rPr>
+                <w:rFonts w:ascii="Calibri" w:eastAsia="Times New Roman" w:hAnsi="Calibri" w:cs="Calibri"/>
+                <w:color w:val="1A1A1A"/>
+                <w:sz w:val="21"/>
+                <w:szCs w:val="21"/>
+              </w:rPr>
+              <w:t xml:space="preserve"> a generic base class), which by itself improves ancestry, descendants and type resolution across the estate.</w:t>
             </w:r>
           </w:p>
         </w:tc>
@@ -8331,7 +9272,17 @@
                 <w:sz w:val="21"/>
                 <w:szCs w:val="21"/>
               </w:rPr>
-              <w:t xml:space="preserve">Document which exceptions a routine </w:t>
+              <w:t xml:space="preserve">Document which exceptions a </w:t>
+            </w:r>
+            <w:proofErr w:type="gramStart"/>
+            <w:r>
+              <w:rPr>
+                <w:rFonts w:ascii="Calibri" w:eastAsia="Times New Roman" w:hAnsi="Calibri" w:cs="Calibri"/>
+                <w:color w:val="1A1A1A"/>
+                <w:sz w:val="21"/>
+                <w:szCs w:val="21"/>
+              </w:rPr>
+              <w:t xml:space="preserve">routine </w:t>
             </w:r>
             <w:r>
               <w:rPr>
@@ -8343,6 +9294,7 @@
               </w:rPr>
               <w:t>handles</w:t>
             </w:r>
+            <w:proofErr w:type="gramEnd"/>
             <w:r>
               <w:rPr>
                 <w:rFonts w:ascii="Calibri" w:eastAsia="Times New Roman" w:hAnsi="Calibri" w:cs="Calibri"/>
@@ -8685,17 +9637,7 @@
           <w:szCs w:val="22"/>
           <w:lang w:val="en"/>
         </w:rPr>
-        <w:t xml:space="preserve"> </w:t>
-      </w:r>
-      <w:r>
-        <w:rPr>
-          <w:rFonts w:ascii="Calibri" w:eastAsia="Times New Roman" w:hAnsi="Calibri" w:cs="Calibri"/>
-          <w:color w:val="1A1A1A"/>
-          <w:sz w:val="22"/>
-          <w:szCs w:val="22"/>
-          <w:lang w:val="en"/>
-        </w:rPr>
-        <w:t xml:space="preserve">A standalone viewer already exists and already talks to the IDE; the work is to give it professional layout and export. Re-estimated from months to about </w:t>
+        <w:t xml:space="preserve"> A standalone viewer already exists and already talks to the IDE; the work is to give it professional layout and export. Re-estimated from months to about </w:t>
       </w:r>
       <w:r>
         <w:rPr>
@@ -8898,8 +9840,9 @@
           <w:szCs w:val="22"/>
           <w:lang w:val="en"/>
         </w:rPr>
-        <w:t xml:space="preserve"> the fix, which was required to fail first. Each also ships what the team calls a positive control -- a second test proving the first one is capable of failing at all. This </w:t>
-      </w:r>
+        <w:t xml:space="preserve"> the fix, which was required to fail first. Each also ships what the team calls </w:t>
+      </w:r>
+      <w:proofErr w:type="gramStart"/>
       <w:r>
         <w:rPr>
           <w:rFonts w:ascii="Calibri" w:hAnsi="Calibri" w:cs="Calibri"/>
@@ -8908,7 +9851,40 @@
           <w:szCs w:val="22"/>
           <w:lang w:val="en"/>
         </w:rPr>
-        <w:t>exists because a test that silently stops checking anything looks exactly like a test that passes.</w:t>
+        <w:t>a positive</w:t>
+      </w:r>
+      <w:proofErr w:type="gramEnd"/>
+      <w:r>
+        <w:rPr>
+          <w:rFonts w:ascii="Calibri" w:hAnsi="Calibri" w:cs="Calibri"/>
+          <w:color w:val="1A1A1A"/>
+          <w:sz w:val="22"/>
+          <w:szCs w:val="22"/>
+          <w:lang w:val="en"/>
+        </w:rPr>
+        <w:t xml:space="preserve"> control -- a second test proving the first one </w:t>
+      </w:r>
+      <w:proofErr w:type="gramStart"/>
+      <w:r>
+        <w:rPr>
+          <w:rFonts w:ascii="Calibri" w:hAnsi="Calibri" w:cs="Calibri"/>
+          <w:color w:val="1A1A1A"/>
+          <w:sz w:val="22"/>
+          <w:szCs w:val="22"/>
+          <w:lang w:val="en"/>
+        </w:rPr>
+        <w:t>is capable of failing</w:t>
+      </w:r>
+      <w:proofErr w:type="gramEnd"/>
+      <w:r>
+        <w:rPr>
+          <w:rFonts w:ascii="Calibri" w:hAnsi="Calibri" w:cs="Calibri"/>
+          <w:color w:val="1A1A1A"/>
+          <w:sz w:val="22"/>
+          <w:szCs w:val="22"/>
+          <w:lang w:val="en"/>
+        </w:rPr>
+        <w:t xml:space="preserve"> at all. This exists because a test that silently stops checking anything looks exactly like a test that passes.</w:t>
       </w:r>
     </w:p>
     <w:p>
@@ -8990,7 +9966,39 @@
           <w:rFonts w:ascii="Calibri" w:hAnsi="Calibri" w:cs="Calibri"/>
           <w:lang w:val="en"/>
         </w:rPr>
-        <w:t xml:space="preserve">Every open item on the board at 16 September 2026, not just the highlights in chapter 13. Effort is a working estimate. </w:t>
+        <w:t xml:space="preserve">Every </w:t>
+      </w:r>
+      <w:proofErr w:type="gramStart"/>
+      <w:r>
+        <w:rPr>
+          <w:rFonts w:ascii="Calibri" w:hAnsi="Calibri" w:cs="Calibri"/>
+          <w:lang w:val="en"/>
+        </w:rPr>
+        <w:t>open item</w:t>
+      </w:r>
+      <w:proofErr w:type="gramEnd"/>
+      <w:r>
+        <w:rPr>
+          <w:rFonts w:ascii="Calibri" w:hAnsi="Calibri" w:cs="Calibri"/>
+          <w:lang w:val="en"/>
+        </w:rPr>
+        <w:t xml:space="preserve"> on the board </w:t>
+      </w:r>
+      <w:proofErr w:type="gramStart"/>
+      <w:r>
+        <w:rPr>
+          <w:rFonts w:ascii="Calibri" w:hAnsi="Calibri" w:cs="Calibri"/>
+          <w:lang w:val="en"/>
+        </w:rPr>
+        <w:t>at</w:t>
+      </w:r>
+      <w:proofErr w:type="gramEnd"/>
+      <w:r>
+        <w:rPr>
+          <w:rFonts w:ascii="Calibri" w:hAnsi="Calibri" w:cs="Calibri"/>
+          <w:lang w:val="en"/>
+        </w:rPr>
+        <w:t xml:space="preserve"> 16 September 2026, not just the highlights in chapter 13. Effort is a working estimate. </w:t>
       </w:r>
       <w:r>
         <w:rPr>
@@ -9032,8 +10040,8 @@
         <w:tblLook w:val="04A0" w:firstRow="1" w:lastRow="0" w:firstColumn="1" w:lastColumn="0" w:noHBand="0" w:noVBand="1"/>
       </w:tblPr>
       <w:tblGrid>
-        <w:gridCol w:w="1597"/>
-        <w:gridCol w:w="6787"/>
+        <w:gridCol w:w="1759"/>
+        <w:gridCol w:w="8641"/>
         <w:gridCol w:w="960"/>
       </w:tblGrid>
       <w:tr>
@@ -9287,8 +10295,29 @@
                 <w:sz w:val="21"/>
                 <w:szCs w:val="21"/>
               </w:rPr>
-              <w:t xml:space="preserve"> drops image data while reporting success. Also widens the conversion to honour every accepted source type (</w:t>
-            </w:r>
+              <w:t xml:space="preserve"> drops image data while reporting success. Also widens the conversion to </w:t>
+            </w:r>
+            <w:proofErr w:type="spellStart"/>
+            <w:r>
+              <w:rPr>
+                <w:rFonts w:ascii="Calibri" w:eastAsia="Times New Roman" w:hAnsi="Calibri" w:cs="Calibri"/>
+                <w:color w:val="1A1A1A"/>
+                <w:sz w:val="21"/>
+                <w:szCs w:val="21"/>
+              </w:rPr>
+              <w:t>honour</w:t>
+            </w:r>
+            <w:proofErr w:type="spellEnd"/>
+            <w:r>
+              <w:rPr>
+                <w:rFonts w:ascii="Calibri" w:eastAsia="Times New Roman" w:hAnsi="Calibri" w:cs="Calibri"/>
+                <w:color w:val="1A1A1A"/>
+                <w:sz w:val="21"/>
+                <w:szCs w:val="21"/>
+              </w:rPr>
+              <w:t xml:space="preserve"> every accepted source type (</w:t>
+            </w:r>
+            <w:proofErr w:type="spellStart"/>
             <w:r>
               <w:rPr>
                 <w:rStyle w:val="HTMLCode"/>
@@ -9296,6 +10325,7 @@
               </w:rPr>
               <w:t>TPicture</w:t>
             </w:r>
+            <w:proofErr w:type="spellEnd"/>
             <w:r>
               <w:rPr>
                 <w:rFonts w:ascii="Calibri" w:eastAsia="Times New Roman" w:hAnsi="Calibri" w:cs="Calibri"/>
@@ -9305,6 +10335,7 @@
               </w:rPr>
               <w:t xml:space="preserve">, </w:t>
             </w:r>
+            <w:proofErr w:type="spellStart"/>
             <w:r>
               <w:rPr>
                 <w:rStyle w:val="HTMLCode"/>
@@ -9312,6 +10343,7 @@
               </w:rPr>
               <w:t>TBitmap</w:t>
             </w:r>
+            <w:proofErr w:type="spellEnd"/>
             <w:r>
               <w:rPr>
                 <w:rFonts w:ascii="Calibri" w:eastAsia="Times New Roman" w:hAnsi="Calibri" w:cs="Calibri"/>
@@ -9321,6 +10353,7 @@
               </w:rPr>
               <w:t xml:space="preserve">, </w:t>
             </w:r>
+            <w:proofErr w:type="spellStart"/>
             <w:r>
               <w:rPr>
                 <w:rStyle w:val="HTMLCode"/>
@@ -9328,6 +10361,7 @@
               </w:rPr>
               <w:t>TGraphic</w:t>
             </w:r>
+            <w:proofErr w:type="spellEnd"/>
             <w:r>
               <w:rPr>
                 <w:rFonts w:ascii="Calibri" w:eastAsia="Times New Roman" w:hAnsi="Calibri" w:cs="Calibri"/>
@@ -9337,6 +10371,7 @@
               </w:rPr>
               <w:t xml:space="preserve">, </w:t>
             </w:r>
+            <w:proofErr w:type="spellStart"/>
             <w:r>
               <w:rPr>
                 <w:rStyle w:val="HTMLCode"/>
@@ -9344,6 +10379,7 @@
               </w:rPr>
               <w:t>TPngImage</w:t>
             </w:r>
+            <w:proofErr w:type="spellEnd"/>
             <w:r>
               <w:rPr>
                 <w:rFonts w:ascii="Calibri" w:eastAsia="Times New Roman" w:hAnsi="Calibri" w:cs="Calibri"/>
@@ -9441,8 +10477,8 @@
         <w:tblLook w:val="04A0" w:firstRow="1" w:lastRow="0" w:firstColumn="1" w:lastColumn="0" w:noHBand="0" w:noVBand="1"/>
       </w:tblPr>
       <w:tblGrid>
-        <w:gridCol w:w="1575"/>
-        <w:gridCol w:w="6785"/>
+        <w:gridCol w:w="1722"/>
+        <w:gridCol w:w="8654"/>
         <w:gridCol w:w="984"/>
       </w:tblGrid>
       <w:tr>
@@ -9657,12 +10693,21 @@
               </w:rPr>
               <w:t xml:space="preserve">A generic base such as </w:t>
             </w:r>
+            <w:proofErr w:type="spellStart"/>
             <w:r>
               <w:rPr>
                 <w:rStyle w:val="HTMLCode"/>
                 <w:color w:val="1A1A1A"/>
               </w:rPr>
-              <w:t>TMicObjectBase&lt;I&gt;</w:t>
+              <w:t>TMicObjectBase</w:t>
+            </w:r>
+            <w:proofErr w:type="spellEnd"/>
+            <w:r>
+              <w:rPr>
+                <w:rStyle w:val="HTMLCode"/>
+                <w:color w:val="1A1A1A"/>
+              </w:rPr>
+              <w:t>&lt;I&gt;</w:t>
             </w:r>
             <w:r>
               <w:rPr>
@@ -9892,7 +10937,17 @@
                 <w:sz w:val="21"/>
                 <w:szCs w:val="21"/>
               </w:rPr>
-              <w:t xml:space="preserve">Exceptions a routine </w:t>
+              <w:t xml:space="preserve">Exceptions a </w:t>
+            </w:r>
+            <w:proofErr w:type="gramStart"/>
+            <w:r>
+              <w:rPr>
+                <w:rFonts w:ascii="Calibri" w:eastAsia="Times New Roman" w:hAnsi="Calibri" w:cs="Calibri"/>
+                <w:color w:val="1A1A1A"/>
+                <w:sz w:val="21"/>
+                <w:szCs w:val="21"/>
+              </w:rPr>
+              <w:t xml:space="preserve">routine </w:t>
             </w:r>
             <w:r>
               <w:rPr>
@@ -9904,6 +10959,7 @@
               </w:rPr>
               <w:t>handles</w:t>
             </w:r>
+            <w:proofErr w:type="gramEnd"/>
           </w:p>
         </w:tc>
         <w:tc>
@@ -10193,16 +11249,7 @@
                 <w:sz w:val="21"/>
                 <w:szCs w:val="21"/>
               </w:rPr>
-              <w:t xml:space="preserve"> </w:t>
-            </w:r>
-            <w:r>
-              <w:rPr>
-                <w:rFonts w:ascii="Calibri" w:eastAsia="Times New Roman" w:hAnsi="Calibri" w:cs="Calibri"/>
-                <w:color w:val="1A1A1A"/>
-                <w:sz w:val="21"/>
-                <w:szCs w:val="21"/>
-              </w:rPr>
-              <w:t>The index records which routines call each other but not which read or write a property. Closing it improves dead-code detection, purity analysis and impact reporting at once, and several smaller items are really waiting on it.</w:t>
+              <w:t xml:space="preserve"> The index records which routines call each other but not which read or write a property. Closing it improves dead-code detection, purity analysis and impact reporting at once, and several smaller items are really waiting on it.</w:t>
             </w:r>
           </w:p>
         </w:tc>
@@ -10396,8 +11443,8 @@
         <w:tblLook w:val="04A0" w:firstRow="1" w:lastRow="0" w:firstColumn="1" w:lastColumn="0" w:noHBand="0" w:noVBand="1"/>
       </w:tblPr>
       <w:tblGrid>
-        <w:gridCol w:w="1625"/>
-        <w:gridCol w:w="6759"/>
+        <w:gridCol w:w="1763"/>
+        <w:gridCol w:w="8637"/>
         <w:gridCol w:w="960"/>
       </w:tblGrid>
       <w:tr>
@@ -10732,7 +11779,27 @@
                 <w:sz w:val="21"/>
                 <w:szCs w:val="21"/>
               </w:rPr>
-              <w:t>A standalone viewer already exists and already talks to the IDE. The work is professional layout and export. Re-estimated from months to weeks once it was established the layout engine should be delegated rather than written. Likely to run on its own track so it does not hold up the engine.</w:t>
+              <w:t xml:space="preserve">A standalone viewer already exists and already talks to the IDE. The work is professional layout and export. Re-estimated from months to </w:t>
+            </w:r>
+            <w:proofErr w:type="gramStart"/>
+            <w:r>
+              <w:rPr>
+                <w:rFonts w:ascii="Calibri" w:eastAsia="Times New Roman" w:hAnsi="Calibri" w:cs="Calibri"/>
+                <w:color w:val="1A1A1A"/>
+                <w:sz w:val="21"/>
+                <w:szCs w:val="21"/>
+              </w:rPr>
+              <w:t>weeks</w:t>
+            </w:r>
+            <w:proofErr w:type="gramEnd"/>
+            <w:r>
+              <w:rPr>
+                <w:rFonts w:ascii="Calibri" w:eastAsia="Times New Roman" w:hAnsi="Calibri" w:cs="Calibri"/>
+                <w:color w:val="1A1A1A"/>
+                <w:sz w:val="21"/>
+                <w:szCs w:val="21"/>
+              </w:rPr>
+              <w:t xml:space="preserve"> once it was established the layout engine should be delegated rather than written. Likely to run on its own track so it does not hold up the engine.</w:t>
             </w:r>
           </w:p>
         </w:tc>
@@ -10771,8 +11838,19 @@
                 <w:sz w:val="21"/>
                 <w:szCs w:val="21"/>
               </w:rPr>
-              <w:t>2-3 wk</w:t>
-            </w:r>
+              <w:t xml:space="preserve">2-3 </w:t>
+            </w:r>
+            <w:proofErr w:type="spellStart"/>
+            <w:r>
+              <w:rPr>
+                <w:rFonts w:ascii="Calibri" w:eastAsia="Times New Roman" w:hAnsi="Calibri" w:cs="Calibri"/>
+                <w:color w:val="1A1A1A"/>
+                <w:sz w:val="21"/>
+                <w:szCs w:val="21"/>
+              </w:rPr>
+              <w:t>wk</w:t>
+            </w:r>
+            <w:proofErr w:type="spellEnd"/>
           </w:p>
         </w:tc>
       </w:tr>
@@ -10926,8 +12004,8 @@
         <w:tblLook w:val="04A0" w:firstRow="1" w:lastRow="0" w:firstColumn="1" w:lastColumn="0" w:noHBand="0" w:noVBand="1"/>
       </w:tblPr>
       <w:tblGrid>
-        <w:gridCol w:w="1759"/>
-        <w:gridCol w:w="6550"/>
+        <w:gridCol w:w="1920"/>
+        <w:gridCol w:w="8405"/>
         <w:gridCol w:w="1035"/>
       </w:tblGrid>
       <w:tr>
@@ -11142,6 +12220,7 @@
               </w:rPr>
               <w:t xml:space="preserve">The </w:t>
             </w:r>
+            <w:proofErr w:type="spellStart"/>
             <w:r>
               <w:rPr>
                 <w:rStyle w:val="HTMLCode"/>
@@ -11149,6 +12228,7 @@
               </w:rPr>
               <w:t>TabcToggleBtn</w:t>
             </w:r>
+            <w:proofErr w:type="spellEnd"/>
             <w:r>
               <w:rPr>
                 <w:rFonts w:ascii="Calibri" w:eastAsia="Times New Roman" w:hAnsi="Calibri" w:cs="Calibri"/>
@@ -11158,6 +12238,7 @@
               </w:rPr>
               <w:t xml:space="preserve"> to </w:t>
             </w:r>
+            <w:proofErr w:type="spellStart"/>
             <w:r>
               <w:rPr>
                 <w:rStyle w:val="HTMLCode"/>
@@ -11165,6 +12246,7 @@
               </w:rPr>
               <w:t>TcxButton</w:t>
             </w:r>
+            <w:proofErr w:type="spellEnd"/>
             <w:r>
               <w:rPr>
                 <w:rFonts w:ascii="Calibri" w:eastAsia="Times New Roman" w:hAnsi="Calibri" w:cs="Calibri"/>
@@ -11292,7 +12374,17 @@
                 <w:sz w:val="21"/>
                 <w:szCs w:val="21"/>
               </w:rPr>
-              <w:t xml:space="preserve">The editor's code-side scan matches any </w:t>
+              <w:t xml:space="preserve">The editor's code-side scan matches </w:t>
+            </w:r>
+            <w:proofErr w:type="gramStart"/>
+            <w:r>
+              <w:rPr>
+                <w:rFonts w:ascii="Calibri" w:eastAsia="Times New Roman" w:hAnsi="Calibri" w:cs="Calibri"/>
+                <w:color w:val="1A1A1A"/>
+                <w:sz w:val="21"/>
+                <w:szCs w:val="21"/>
+              </w:rPr>
+              <w:t xml:space="preserve">any </w:t>
             </w:r>
             <w:r>
               <w:rPr>
@@ -11301,6 +12393,7 @@
               </w:rPr>
               <w:t>.Property</w:t>
             </w:r>
+            <w:proofErr w:type="gramEnd"/>
             <w:r>
               <w:rPr>
                 <w:rFonts w:ascii="Calibri" w:eastAsia="Times New Roman" w:hAnsi="Calibri" w:cs="Calibri"/>
@@ -11654,8 +12747,8 @@
         <w:tblLook w:val="04A0" w:firstRow="1" w:lastRow="0" w:firstColumn="1" w:lastColumn="0" w:noHBand="0" w:noVBand="1"/>
       </w:tblPr>
       <w:tblGrid>
-        <w:gridCol w:w="1397"/>
-        <w:gridCol w:w="6955"/>
+        <w:gridCol w:w="1523"/>
+        <w:gridCol w:w="8845"/>
         <w:gridCol w:w="992"/>
       </w:tblGrid>
       <w:tr>
@@ -11884,16 +12977,7 @@
                 <w:sz w:val="21"/>
                 <w:szCs w:val="21"/>
               </w:rPr>
-              <w:t xml:space="preserve"> </w:t>
-            </w:r>
-            <w:r>
-              <w:rPr>
-                <w:rFonts w:ascii="Calibri" w:eastAsia="Times New Roman" w:hAnsi="Calibri" w:cs="Calibri"/>
-                <w:color w:val="1A1A1A"/>
-                <w:sz w:val="21"/>
-                <w:szCs w:val="21"/>
-              </w:rPr>
-              <w:t>is reported as a hardcoded IP address; and a legitimately suppressed project-wide finding is then reported as an unnecessary suppression, so the two messages contradict each other. Small, but exactly the kind of noise that teaches people to skim the linter.</w:t>
+              <w:t xml:space="preserve"> is reported as a hardcoded IP address; and a legitimately suppressed project-wide finding is then reported as an unnecessary suppression, so the two messages contradict each other. Small, but exactly the kind of noise that teaches people to skim the linter.</w:t>
             </w:r>
           </w:p>
         </w:tc>
@@ -12013,7 +13097,29 @@
                 <w:sz w:val="21"/>
                 <w:szCs w:val="21"/>
               </w:rPr>
-              <w:t>Housekeeping: an old worktree and branch are still registered after the work moved. Awaiting a go-ahead rather than effort.</w:t>
+              <w:t xml:space="preserve">Housekeeping: an old </w:t>
+            </w:r>
+            <w:proofErr w:type="spellStart"/>
+            <w:proofErr w:type="gramStart"/>
+            <w:r>
+              <w:rPr>
+                <w:rFonts w:ascii="Calibri" w:eastAsia="Times New Roman" w:hAnsi="Calibri" w:cs="Calibri"/>
+                <w:color w:val="1A1A1A"/>
+                <w:sz w:val="21"/>
+                <w:szCs w:val="21"/>
+              </w:rPr>
+              <w:t>worktree</w:t>
+            </w:r>
+            <w:proofErr w:type="spellEnd"/>
+            <w:proofErr w:type="gramEnd"/>
+            <w:r>
+              <w:rPr>
+                <w:rFonts w:ascii="Calibri" w:eastAsia="Times New Roman" w:hAnsi="Calibri" w:cs="Calibri"/>
+                <w:color w:val="1A1A1A"/>
+                <w:sz w:val="21"/>
+                <w:szCs w:val="21"/>
+              </w:rPr>
+              <w:t xml:space="preserve"> and branch are still registered after the work moved. Awaiting a go-ahead rather than effort.</w:t>
             </w:r>
           </w:p>
         </w:tc>
@@ -12091,17 +13197,7 @@
           <w:szCs w:val="22"/>
           <w:lang w:val="en"/>
         </w:rPr>
-        <w:t xml:space="preserve"> The release ships with eight commits </w:t>
-      </w:r>
-      <w:r>
-        <w:rPr>
-          <w:rFonts w:ascii="Calibri" w:hAnsi="Calibri" w:cs="Calibri"/>
-          <w:color w:val="1A1A1A"/>
-          <w:sz w:val="22"/>
-          <w:szCs w:val="22"/>
-          <w:lang w:val="en"/>
-        </w:rPr>
-        <w:t>not yet published to the shared repository -- that is a decision for the owner, not a work item. And the converter's image-drop limitation is listed once, as A.1; it is a defect being fixed first, not a feature being added.</w:t>
+        <w:t xml:space="preserve"> The release ships with eight commits not yet published to the shared repository -- that is a decision for the owner, not a work item. And the converter's image-drop limitation is listed once, as A.1; it is a defect being fixed first, not a feature being added.</w:t>
       </w:r>
     </w:p>
     <w:p>
@@ -12126,8 +13222,17 @@
           <w:rStyle w:val="HTMLCode"/>
           <w:lang w:val="en"/>
         </w:rPr>
-        <w:t>drag-lint rules --json</w:t>
-      </w:r>
+        <w:t>drag-lint rules --</w:t>
+      </w:r>
+      <w:proofErr w:type="spellStart"/>
+      <w:r>
+        <w:rPr>
+          <w:rStyle w:val="HTMLCode"/>
+          <w:lang w:val="en"/>
+        </w:rPr>
+        <w:t>json</w:t>
+      </w:r>
+      <w:proofErr w:type="spellEnd"/>
       <w:r>
         <w:rPr>
           <w:rFonts w:ascii="Calibri" w:hAnsi="Calibri" w:cs="Calibri"/>
@@ -12164,14 +13269,7 @@
           <w:rFonts w:ascii="Calibri" w:hAnsi="Calibri" w:cs="Calibri"/>
           <w:lang w:val="en"/>
         </w:rPr>
-        <w:t xml:space="preserve">), and the MCP tool count from the server's own tool list -- </w:t>
-      </w:r>
-      <w:r>
-        <w:rPr>
-          <w:rFonts w:ascii="Calibri" w:hAnsi="Calibri" w:cs="Calibri"/>
-          <w:lang w:val="en"/>
-        </w:rPr>
-        <w:t>all taken on 16 September 2026 against drag-lint 1.13.0-alpha. The roadmap in Appendix A is the project's real open-item list on that date, not a selection.</w:t>
+        <w:t>), and the MCP tool count from the server's own tool list -- all taken on 16 September 2026 against drag-lint 1.13.0-alpha. The roadmap in Appendix A is the project's real open-item list on that date, not a selection.</w:t>
       </w:r>
       <w:r>
         <w:rPr>
@@ -12205,7 +13303,7 @@
     </w:p>
     <w:sectPr>
       <w:pgSz w:w="12240" w:h="15840"/>
-      <w:pgMar w:top="1440" w:right="1440" w:bottom="1440" w:left="1440" w:header="720" w:footer="720" w:gutter="0"/>
+      <w:pgMar w:top="432" w:right="432" w:bottom="432" w:left="432" w:header="720" w:footer="720" w:gutter="0"/>
       <w:cols w:space="720"/>
       <w:docGrid w:linePitch="360"/>
     </w:sectPr>

</xml_diff>